<commit_message>
refactor: migrate assets to WebP, overhaul community portal navigation in explore games , and update documentation for the unified platform model
</commit_message>
<xml_diff>
--- a/NUVRA_User_Documentation.docx
+++ b/NUVRA_User_Documentation.docx
@@ -4,468 +4,275 @@
   <w:body>
     <w:p>
       <w:pPr>
-        <w:spacing w:before="1200" w:after="0"/>
-        <w:jc w:val="center"/>
+        <w:pStyle w:val="Heading1"/>
       </w:pPr>
       <w:r>
-        <w:rPr>
-          <w:b/>
-          <w:color w:val="0D1B3E"/>
-          <w:sz w:val="96"/>
-        </w:rPr>
-        <w:t>NUVRA</w:t>
+        <w:t>NUVRA Platform — End User Documentation</w:t>
+      </w:r>
+    </w:p>
+    <w:p>
+      <w:r>
+        <w:t>Version: 2.0</w:t>
+      </w:r>
+    </w:p>
+    <w:p>
+      <w:r>
+        <w:t>Prepared for: NUVRA Users &amp; Community Members</w:t>
+      </w:r>
+    </w:p>
+    <w:p>
+      <w:r>
+        <w:t>Date: June 11, 2026</w:t>
       </w:r>
     </w:p>
     <w:p>
       <w:pPr>
-        <w:spacing w:before="0" w:after="80"/>
-        <w:jc w:val="center"/>
+        <w:pStyle w:val="Heading2"/>
       </w:pPr>
       <w:r>
-        <w:rPr>
-          <w:b/>
-          <w:color w:val="16A34A"/>
-          <w:sz w:val="36"/>
-        </w:rPr>
-        <w:t>Football Management Platform</w:t>
+        <w:t>Table of Contents</w:t>
       </w:r>
     </w:p>
     <w:p>
       <w:pPr>
-        <w:pBdr>
-          <w:bottom w:val="single" w:sz="6" w:space="1" w:color="16A34A"/>
-        </w:pBdr>
-        <w:spacing w:before="0" w:after="0"/>
-      </w:pPr>
-    </w:p>
-    <w:p>
-      <w:pPr>
-        <w:spacing w:before="120" w:after="0"/>
-        <w:jc w:val="center"/>
+        <w:pStyle w:val="ListNumber"/>
       </w:pPr>
       <w:r>
-        <w:rPr>
-          <w:b/>
-          <w:color w:val="556581"/>
-          <w:sz w:val="22"/>
-        </w:rPr>
-        <w:t xml:space="preserve">Document Type:  </w:t>
-      </w:r>
-      <w:r>
-        <w:rPr>
-          <w:color w:val="1A1A2E"/>
-          <w:sz w:val="22"/>
-        </w:rPr>
-        <w:t>End User Documentation</w:t>
+        <w:t>[Platform Overview](#1-platform-overview)</w:t>
       </w:r>
     </w:p>
     <w:p>
       <w:pPr>
-        <w:spacing w:before="120" w:after="0"/>
-        <w:jc w:val="center"/>
+        <w:pStyle w:val="ListNumber"/>
       </w:pPr>
       <w:r>
-        <w:rPr>
-          <w:b/>
-          <w:color w:val="556581"/>
-          <w:sz w:val="22"/>
-        </w:rPr>
-        <w:t xml:space="preserve">Prepared for:  </w:t>
+        <w:t>[User Roles at a Glance](#2-user-roles-at-a-glance)</w:t>
       </w:r>
+    </w:p>
+    <w:p>
       <w:r>
-        <w:rPr>
-          <w:color w:val="1A1A2E"/>
-          <w:sz w:val="22"/>
-        </w:rPr>
-        <w:t>Business Team</w:t>
+        <w:t>3. [Getting Started](#3-getting-started)</w:t>
       </w:r>
     </w:p>
     <w:p>
       <w:pPr>
-        <w:spacing w:before="120" w:after="0"/>
-        <w:jc w:val="center"/>
+        <w:pStyle w:val="ListBullet"/>
       </w:pPr>
       <w:r>
-        <w:rPr>
-          <w:b/>
-          <w:color w:val="556581"/>
-          <w:sz w:val="22"/>
-        </w:rPr>
-        <w:t xml:space="preserve">Version:  </w:t>
-      </w:r>
-      <w:r>
-        <w:rPr>
-          <w:color w:val="1A1A2E"/>
-          <w:sz w:val="22"/>
-        </w:rPr>
-        <w:t>1.0</w:t>
+        <w:t>3.1 [Registration &amp; Login](#31-registration--login)</w:t>
       </w:r>
     </w:p>
     <w:p>
       <w:pPr>
-        <w:spacing w:before="120" w:after="0"/>
-        <w:jc w:val="center"/>
+        <w:pStyle w:val="ListBullet"/>
       </w:pPr>
       <w:r>
-        <w:rPr>
-          <w:b/>
-          <w:color w:val="556581"/>
-          <w:sz w:val="22"/>
-        </w:rPr>
-        <w:t xml:space="preserve">Date:  </w:t>
-      </w:r>
-      <w:r>
-        <w:rPr>
-          <w:color w:val="1A1A2E"/>
-          <w:sz w:val="22"/>
-        </w:rPr>
-        <w:t>May 2026</w:t>
+        <w:t>3.2 [Google Login](#32-google-login)</w:t>
       </w:r>
     </w:p>
     <w:p>
       <w:r>
-        <w:br w:type="page"/>
+        <w:t>4. [For Players: Finding &amp; Joining Games](#4-for-players-finding--joining-games)</w:t>
       </w:r>
     </w:p>
     <w:p>
       <w:pPr>
-        <w:spacing w:before="360" w:after="80"/>
-        <w:jc w:val="left"/>
+        <w:pStyle w:val="ListBullet"/>
       </w:pPr>
       <w:r>
-        <w:rPr>
-          <w:b/>
-          <w:color w:val="0D1B3E"/>
-          <w:sz w:val="44"/>
-        </w:rPr>
-        <w:t>1.  Platform Overview</w:t>
+        <w:t>4.1 [Browsing the Game Feed](#41-browsing-the-game-feed)</w:t>
       </w:r>
     </w:p>
     <w:p>
       <w:pPr>
-        <w:pBdr>
-          <w:bottom w:val="single" w:sz="6" w:space="1" w:color="16A34A"/>
-        </w:pBdr>
-        <w:spacing w:before="0" w:after="0"/>
+        <w:pStyle w:val="ListBullet"/>
       </w:pPr>
+      <w:r>
+        <w:t>4.2 [Joining a Game](#42-joining-a-game)</w:t>
+      </w:r>
     </w:p>
     <w:p>
       <w:pPr>
-        <w:spacing w:before="40" w:after="80"/>
+        <w:pStyle w:val="ListBullet"/>
       </w:pPr>
       <w:r>
-        <w:rPr>
-          <w:i w:val="0"/>
-          <w:color w:val="1A1A2E"/>
-          <w:sz w:val="21"/>
-        </w:rPr>
-        <w:t>NUVRA is a football management platform with two distinct portals operating under one roof:</w:t>
+        <w:t>4.3 [Payment &amp; Receipt Upload](#43-payment--receipt-upload)</w:t>
+      </w:r>
+    </w:p>
+    <w:p>
+      <w:pPr>
+        <w:pStyle w:val="ListBullet"/>
+      </w:pPr>
+      <w:r>
+        <w:t>4.4 [Withdrawing from a Game](#44-withdrawing-from-a-game)</w:t>
+      </w:r>
+    </w:p>
+    <w:p>
+      <w:r>
+        <w:t>5. [Player Dashboard &amp; Profile](#5-player-dashboard--profile)</w:t>
+      </w:r>
+    </w:p>
+    <w:p>
+      <w:pPr>
+        <w:pStyle w:val="ListBullet"/>
+      </w:pPr>
+      <w:r>
+        <w:t>5.1 [Performance Analytics](#51-performance-analytics)</w:t>
+      </w:r>
+    </w:p>
+    <w:p>
+      <w:pPr>
+        <w:pStyle w:val="ListBullet"/>
+      </w:pPr>
+      <w:r>
+        <w:t>5.2 [Profile Customization](#52-profile-customization)</w:t>
+      </w:r>
+    </w:p>
+    <w:p>
+      <w:pPr>
+        <w:pStyle w:val="ListBullet"/>
+      </w:pPr>
+      <w:r>
+        <w:t>5.3 [Member Directory](#53-member-directory)</w:t>
+      </w:r>
+    </w:p>
+    <w:p>
+      <w:r>
+        <w:t>6. [For Organizers: Managing Games](#6-for-organizers-managing-games)</w:t>
+      </w:r>
+    </w:p>
+    <w:p>
+      <w:pPr>
+        <w:pStyle w:val="ListBullet"/>
+      </w:pPr>
+      <w:r>
+        <w:t>6.1 [Creating a Game](#61-creating-a-game)</w:t>
+      </w:r>
+    </w:p>
+    <w:p>
+      <w:pPr>
+        <w:pStyle w:val="ListBullet"/>
+      </w:pPr>
+      <w:r>
+        <w:t>6.2 [Booking Approval Flow](#62-booking-approval-flow)</w:t>
+      </w:r>
+    </w:p>
+    <w:p>
+      <w:pPr>
+        <w:pStyle w:val="ListBullet"/>
+      </w:pPr>
+      <w:r>
+        <w:t>6.3 [Cancelling a Game](#63-cancelling-a-game)</w:t>
+      </w:r>
+    </w:p>
+    <w:p>
+      <w:pPr>
+        <w:pStyle w:val="ListBullet"/>
+      </w:pPr>
+      <w:r>
+        <w:t>6.4 [Community Announcements](#64-community-announcements)</w:t>
+      </w:r>
+    </w:p>
+    <w:p>
+      <w:pPr>
+        <w:pStyle w:val="ListBullet"/>
+      </w:pPr>
+      <w:r>
+        <w:t>6.5 [Organizer Analytics](#65-organizer-analytics)</w:t>
+      </w:r>
+    </w:p>
+    <w:p>
+      <w:r>
+        <w:t>7. [Payments Summary](#7-payments-summary)</w:t>
+      </w:r>
+    </w:p>
+    <w:p>
+      <w:r>
+        <w:t>8. [Frequently Asked Questions (FAQ)](#8-frequently-asked-questions-faq)</w:t>
+      </w:r>
+    </w:p>
+    <w:p>
+      <w:pPr>
+        <w:pStyle w:val="Heading2"/>
+      </w:pPr>
+      <w:r>
+        <w:t>1. Platform Overview</w:t>
+      </w:r>
+    </w:p>
+    <w:p>
+      <w:r>
+        <w:t>NUVRA is a unified football management and discovery platform. It has transitioned to a Unified Community Model designed to bring together organizers and players in a flat, accessible ecosystem.</w:t>
+      </w:r>
+    </w:p>
+    <w:p>
+      <w:r>
+        <w:t>Instead of rigid club structures, NUVRA focuses on:</w:t>
+      </w:r>
+    </w:p>
+    <w:p>
+      <w:pPr>
+        <w:pStyle w:val="ListBullet"/>
+      </w:pPr>
+      <w:r>
+        <w:t>**Game Discovery:** Easily find and join pickup games.</w:t>
+      </w:r>
+    </w:p>
+    <w:p>
+      <w:pPr>
+        <w:pStyle w:val="ListBullet"/>
+      </w:pPr>
+      <w:r>
+        <w:t>**Social Performance:** Track your stats across different games and venues.</w:t>
+      </w:r>
+    </w:p>
+    <w:p>
+      <w:pPr>
+        <w:pStyle w:val="ListBullet"/>
+      </w:pPr>
+      <w:r>
+        <w:t>**Easy Management:** Organizers can set up games, manage slots, and handle payments in one place.</w:t>
+      </w:r>
+    </w:p>
+    <w:p>
+      <w:pPr>
+        <w:pStyle w:val="Heading2"/>
+      </w:pPr>
+      <w:r>
+        <w:t>2. User Roles at a Glance</w:t>
+      </w:r>
+    </w:p>
+    <w:p>
+      <w:r>
+        <w:t>All users share a unified identity system, but can act in different capacities:</w:t>
       </w:r>
     </w:p>
     <w:tbl>
       <w:tblPr>
         <w:tblStyle w:val="TableGrid"/>
         <w:tblW w:type="auto" w:w="0"/>
-        <w:jc w:val="left"/>
         <w:tblLook w:firstColumn="1" w:firstRow="1" w:lastColumn="0" w:lastRow="0" w:noHBand="0" w:noVBand="1" w:val="04A0"/>
       </w:tblPr>
       <w:tblGrid>
-        <w:gridCol w:w="3022"/>
-        <w:gridCol w:w="3022"/>
-        <w:gridCol w:w="3022"/>
+        <w:gridCol w:w="4320"/>
+        <w:gridCol w:w="4320"/>
       </w:tblGrid>
       <w:tr>
         <w:tc>
           <w:tcPr>
-            <w:tcW w:type="dxa" w:w="2160"/>
-            <w:shd w:val="clear" w:color="auto" w:fill="0D1B3E"/>
-            <w:vAlign w:val="center"/>
+            <w:tcW w:type="dxa" w:w="4320"/>
           </w:tcPr>
           <w:p>
-            <w:pPr>
-              <w:spacing w:before="80" w:after="80"/>
-              <w:jc w:val="center"/>
-            </w:pPr>
             <w:r>
-              <w:rPr>
-                <w:b/>
-                <w:color w:val="FFFFFF"/>
-                <w:sz w:val="20"/>
-              </w:rPr>
-              <w:t>Portal</w:t>
-            </w:r>
-          </w:p>
-        </w:tc>
-        <w:tc>
-          <w:tcPr>
-            <w:tcW w:type="dxa" w:w="4608"/>
-            <w:shd w:val="clear" w:color="auto" w:fill="0D1B3E"/>
-            <w:vAlign w:val="center"/>
-          </w:tcPr>
-          <w:p>
-            <w:pPr>
-              <w:spacing w:before="80" w:after="80"/>
-              <w:jc w:val="center"/>
-            </w:pPr>
-            <w:r>
-              <w:rPr>
-                <w:b/>
-                <w:color w:val="FFFFFF"/>
-                <w:sz w:val="20"/>
-              </w:rPr>
-              <w:t>Purpose</w:t>
-            </w:r>
-          </w:p>
-        </w:tc>
-        <w:tc>
-          <w:tcPr>
-            <w:tcW w:type="dxa" w:w="2880"/>
-            <w:shd w:val="clear" w:color="auto" w:fill="0D1B3E"/>
-            <w:vAlign w:val="center"/>
-          </w:tcPr>
-          <w:p>
-            <w:pPr>
-              <w:spacing w:before="80" w:after="80"/>
-              <w:jc w:val="center"/>
-            </w:pPr>
-            <w:r>
-              <w:rPr>
-                <w:b/>
-                <w:color w:val="FFFFFF"/>
-                <w:sz w:val="20"/>
-              </w:rPr>
-              <w:t>Who Uses It</w:t>
-            </w:r>
-          </w:p>
-        </w:tc>
-      </w:tr>
-      <w:tr>
-        <w:tc>
-          <w:tcPr>
-            <w:tcW w:type="dxa" w:w="2160"/>
-            <w:shd w:val="clear" w:color="auto" w:fill="FFFFFF"/>
-            <w:vAlign w:val="center"/>
-          </w:tcPr>
-          <w:p>
-            <w:pPr>
-              <w:spacing w:before="60" w:after="60"/>
-            </w:pPr>
-            <w:r>
-              <w:rPr>
-                <w:color w:val="1A1A2E"/>
-                <w:sz w:val="20"/>
-              </w:rPr>
-              <w:t>Club Portal</w:t>
-            </w:r>
-          </w:p>
-        </w:tc>
-        <w:tc>
-          <w:tcPr>
-            <w:tcW w:type="dxa" w:w="4608"/>
-            <w:shd w:val="clear" w:color="auto" w:fill="FFFFFF"/>
-            <w:vAlign w:val="center"/>
-          </w:tcPr>
-          <w:p>
-            <w:pPr>
-              <w:spacing w:before="60" w:after="60"/>
-            </w:pPr>
-            <w:r>
-              <w:rPr>
-                <w:color w:val="1A1A2E"/>
-                <w:sz w:val="20"/>
-              </w:rPr>
-              <w:t>Professional team management — track squad performance, schedules, and monthly payments.</w:t>
-            </w:r>
-          </w:p>
-        </w:tc>
-        <w:tc>
-          <w:tcPr>
-            <w:tcW w:type="dxa" w:w="2880"/>
-            <w:shd w:val="clear" w:color="auto" w:fill="FFFFFF"/>
-            <w:vAlign w:val="center"/>
-          </w:tcPr>
-          <w:p>
-            <w:pPr>
-              <w:spacing w:before="60" w:after="60"/>
-            </w:pPr>
-            <w:r>
-              <w:rPr>
-                <w:color w:val="1A1A2E"/>
-                <w:sz w:val="20"/>
-              </w:rPr>
-              <w:t>Coaches and registered team players</w:t>
-            </w:r>
-          </w:p>
-        </w:tc>
-      </w:tr>
-      <w:tr>
-        <w:tc>
-          <w:tcPr>
-            <w:tcW w:type="dxa" w:w="2160"/>
-            <w:shd w:val="clear" w:color="auto" w:fill="F5F7FB"/>
-            <w:vAlign w:val="center"/>
-          </w:tcPr>
-          <w:p>
-            <w:pPr>
-              <w:spacing w:before="60" w:after="60"/>
-            </w:pPr>
-            <w:r>
-              <w:rPr>
-                <w:color w:val="1A1A2E"/>
-                <w:sz w:val="20"/>
-              </w:rPr>
-              <w:t>Community Portal</w:t>
-            </w:r>
-          </w:p>
-        </w:tc>
-        <w:tc>
-          <w:tcPr>
-            <w:tcW w:type="dxa" w:w="4608"/>
-            <w:shd w:val="clear" w:color="auto" w:fill="F5F7FB"/>
-            <w:vAlign w:val="center"/>
-          </w:tcPr>
-          <w:p>
-            <w:pPr>
-              <w:spacing w:before="60" w:after="60"/>
-            </w:pPr>
-            <w:r>
-              <w:rPr>
-                <w:color w:val="1A1A2E"/>
-                <w:sz w:val="20"/>
-              </w:rPr>
-              <w:t>Recreational / grassroots football — find, join, and pay for community pickup games.</w:t>
-            </w:r>
-          </w:p>
-        </w:tc>
-        <w:tc>
-          <w:tcPr>
-            <w:tcW w:type="dxa" w:w="2880"/>
-            <w:shd w:val="clear" w:color="auto" w:fill="F5F7FB"/>
-            <w:vAlign w:val="center"/>
-          </w:tcPr>
-          <w:p>
-            <w:pPr>
-              <w:spacing w:before="60" w:after="60"/>
-            </w:pPr>
-            <w:r>
-              <w:rPr>
-                <w:color w:val="1A1A2E"/>
-                <w:sz w:val="20"/>
-              </w:rPr>
-              <w:t>Community players and community admins</w:t>
-            </w:r>
-          </w:p>
-        </w:tc>
-      </w:tr>
-    </w:tbl>
-    <w:p/>
-    <w:p>
-      <w:pPr>
-        <w:spacing w:before="40" w:after="80"/>
-      </w:pPr>
-      <w:r>
-        <w:rPr>
-          <w:i w:val="0"/>
-          <w:color w:val="1A1A2E"/>
-          <w:sz w:val="21"/>
-        </w:rPr>
-        <w:t>Both portals are accessible from the same web application. Users register and log in separately for each portal.</w:t>
-      </w:r>
-    </w:p>
-    <w:p>
-      <w:pPr>
-        <w:spacing w:before="360" w:after="80"/>
-        <w:jc w:val="left"/>
-      </w:pPr>
-      <w:r>
-        <w:rPr>
-          <w:b/>
-          <w:color w:val="0D1B3E"/>
-          <w:sz w:val="44"/>
-        </w:rPr>
-        <w:t>2.  User Roles at a Glance</w:t>
-      </w:r>
-    </w:p>
-    <w:p>
-      <w:pPr>
-        <w:pBdr>
-          <w:bottom w:val="single" w:sz="6" w:space="1" w:color="16A34A"/>
-        </w:pBdr>
-        <w:spacing w:before="0" w:after="0"/>
-      </w:pPr>
-    </w:p>
-    <w:tbl>
-      <w:tblPr>
-        <w:tblStyle w:val="TableGrid"/>
-        <w:tblW w:type="auto" w:w="0"/>
-        <w:jc w:val="left"/>
-        <w:tblLook w:firstColumn="1" w:firstRow="1" w:lastColumn="0" w:lastRow="0" w:noHBand="0" w:noVBand="1" w:val="04A0"/>
-      </w:tblPr>
-      <w:tblGrid>
-        <w:gridCol w:w="3022"/>
-        <w:gridCol w:w="3022"/>
-        <w:gridCol w:w="3022"/>
-      </w:tblGrid>
-      <w:tr>
-        <w:tc>
-          <w:tcPr>
-            <w:tcW w:type="dxa" w:w="2160"/>
-            <w:shd w:val="clear" w:color="auto" w:fill="0D1B3E"/>
-            <w:vAlign w:val="center"/>
-          </w:tcPr>
-          <w:p>
-            <w:pPr>
-              <w:spacing w:before="80" w:after="80"/>
-              <w:jc w:val="center"/>
-            </w:pPr>
-            <w:r>
-              <w:rPr>
-                <w:b/>
-                <w:color w:val="FFFFFF"/>
-                <w:sz w:val="20"/>
-              </w:rPr>
               <w:t>Role</w:t>
             </w:r>
           </w:p>
         </w:tc>
         <w:tc>
           <w:tcPr>
-            <w:tcW w:type="dxa" w:w="2016"/>
-            <w:shd w:val="clear" w:color="auto" w:fill="0D1B3E"/>
-            <w:vAlign w:val="center"/>
+            <w:tcW w:type="dxa" w:w="4320"/>
           </w:tcPr>
           <w:p>
-            <w:pPr>
-              <w:spacing w:before="80" w:after="80"/>
-              <w:jc w:val="center"/>
-            </w:pPr>
             <w:r>
-              <w:rPr>
-                <w:b/>
-                <w:color w:val="FFFFFF"/>
-                <w:sz w:val="20"/>
-              </w:rPr>
-              <w:t>Portal</w:t>
-            </w:r>
-          </w:p>
-        </w:tc>
-        <w:tc>
-          <w:tcPr>
-            <w:tcW w:type="dxa" w:w="5472"/>
-            <w:shd w:val="clear" w:color="auto" w:fill="0D1B3E"/>
-            <w:vAlign w:val="center"/>
-          </w:tcPr>
-          <w:p>
-            <w:pPr>
-              <w:spacing w:before="80" w:after="80"/>
-              <w:jc w:val="center"/>
-            </w:pPr>
-            <w:r>
-              <w:rPr>
-                <w:b/>
-                <w:color w:val="FFFFFF"/>
-                <w:sz w:val="20"/>
-              </w:rPr>
               <w:t>Key Abilities</w:t>
             </w:r>
           </w:p>
@@ -474,58 +281,21 @@
       <w:tr>
         <w:tc>
           <w:tcPr>
-            <w:tcW w:type="dxa" w:w="2160"/>
-            <w:shd w:val="clear" w:color="auto" w:fill="FFFFFF"/>
-            <w:vAlign w:val="center"/>
+            <w:tcW w:type="dxa" w:w="4320"/>
           </w:tcPr>
           <w:p>
-            <w:pPr>
-              <w:spacing w:before="60" w:after="60"/>
-            </w:pPr>
             <w:r>
-              <w:rPr>
-                <w:color w:val="1A1A2E"/>
-                <w:sz w:val="20"/>
-              </w:rPr>
-              <w:t>Coach</w:t>
+              <w:t>**Organizer** (Club Owner)</w:t>
             </w:r>
           </w:p>
         </w:tc>
         <w:tc>
           <w:tcPr>
-            <w:tcW w:type="dxa" w:w="2016"/>
-            <w:shd w:val="clear" w:color="auto" w:fill="FFFFFF"/>
-            <w:vAlign w:val="center"/>
+            <w:tcW w:type="dxa" w:w="4320"/>
           </w:tcPr>
           <w:p>
-            <w:pPr>
-              <w:spacing w:before="60" w:after="60"/>
-            </w:pPr>
             <w:r>
-              <w:rPr>
-                <w:color w:val="1A1A2E"/>
-                <w:sz w:val="20"/>
-              </w:rPr>
-              <w:t>Club</w:t>
-            </w:r>
-          </w:p>
-        </w:tc>
-        <w:tc>
-          <w:tcPr>
-            <w:tcW w:type="dxa" w:w="5472"/>
-            <w:shd w:val="clear" w:color="auto" w:fill="FFFFFF"/>
-            <w:vAlign w:val="center"/>
-          </w:tcPr>
-          <w:p>
-            <w:pPr>
-              <w:spacing w:before="60" w:after="60"/>
-            </w:pPr>
-            <w:r>
-              <w:rPr>
-                <w:color w:val="1A1A2E"/>
-                <w:sz w:val="20"/>
-              </w:rPr>
-              <w:t>Manage squad, log match stats, post announcements, manage schedule, view team payments</w:t>
+              <w:t>Create games, set pricing, upload payment QR codes, and approve/reject player bookings.</w:t>
             </w:r>
           </w:p>
         </w:tc>
@@ -533,58 +303,523 @@
       <w:tr>
         <w:tc>
           <w:tcPr>
-            <w:tcW w:type="dxa" w:w="2160"/>
-            <w:shd w:val="clear" w:color="auto" w:fill="F5F7FB"/>
-            <w:vAlign w:val="center"/>
+            <w:tcW w:type="dxa" w:w="4320"/>
           </w:tcPr>
           <w:p>
-            <w:pPr>
-              <w:spacing w:before="60" w:after="60"/>
-            </w:pPr>
             <w:r>
-              <w:rPr>
-                <w:color w:val="1A1A2E"/>
-                <w:sz w:val="20"/>
-              </w:rPr>
-              <w:t>Player</w:t>
+              <w:t>**Player**</w:t>
             </w:r>
           </w:p>
         </w:tc>
         <w:tc>
           <w:tcPr>
-            <w:tcW w:type="dxa" w:w="2016"/>
-            <w:shd w:val="clear" w:color="auto" w:fill="F5F7FB"/>
-            <w:vAlign w:val="center"/>
+            <w:tcW w:type="dxa" w:w="4320"/>
           </w:tcPr>
           <w:p>
-            <w:pPr>
-              <w:spacing w:before="60" w:after="60"/>
-            </w:pPr>
             <w:r>
-              <w:rPr>
-                <w:color w:val="1A1A2E"/>
-                <w:sz w:val="20"/>
-              </w:rPr>
-              <w:t>Club</w:t>
+              <w:t>Browse games, join teams, upload payment receipts, and track individual performance stats.</w:t>
+            </w:r>
+          </w:p>
+        </w:tc>
+      </w:tr>
+    </w:tbl>
+    <w:p>
+      <w:pPr>
+        <w:pStyle w:val="Heading2"/>
+      </w:pPr>
+      <w:r>
+        <w:t>3. Getting Started</w:t>
+      </w:r>
+    </w:p>
+    <w:p>
+      <w:pPr>
+        <w:pStyle w:val="Heading3"/>
+      </w:pPr>
+      <w:r>
+        <w:t>3.1 Registration &amp; Login</w:t>
+      </w:r>
+    </w:p>
+    <w:p>
+      <w:r>
+        <w:t>NUVRA uses a single, unified authentication system. You no longer need separate accounts for different portals.</w:t>
+      </w:r>
+    </w:p>
+    <w:p>
+      <w:pPr>
+        <w:pStyle w:val="ListNumber"/>
+      </w:pPr>
+      <w:r>
+        <w:t>**Sign Up:** Create an account using your email and a password.</w:t>
+      </w:r>
+    </w:p>
+    <w:p>
+      <w:pPr>
+        <w:pStyle w:val="ListNumber"/>
+      </w:pPr>
+      <w:r>
+        <w:t>**Onboarding:** After registering, you can set up your initial profile, including your playing position and basic info.</w:t>
+      </w:r>
+    </w:p>
+    <w:p>
+      <w:r>
+        <w:t>3. Login: Use your credentials to access the platform.</w:t>
+      </w:r>
+    </w:p>
+    <w:p>
+      <w:pPr>
+        <w:pStyle w:val="Heading3"/>
+      </w:pPr>
+      <w:r>
+        <w:t>3.2 Google Login</w:t>
+      </w:r>
+    </w:p>
+    <w:p>
+      <w:r>
+        <w:t>You can skip the manual registration by clicking Continue with Google. This will automatically create your NUVRA account using your Google profile information.</w:t>
+      </w:r>
+    </w:p>
+    <w:p>
+      <w:pPr>
+        <w:pStyle w:val="Heading2"/>
+      </w:pPr>
+      <w:r>
+        <w:t>4. For Players: Finding &amp; Joining Games</w:t>
+      </w:r>
+    </w:p>
+    <w:p>
+      <w:r>
+        <w:t>The core of the NUVRA experience is the Community Feed.</w:t>
+      </w:r>
+    </w:p>
+    <w:p>
+      <w:pPr>
+        <w:pStyle w:val="Heading3"/>
+      </w:pPr>
+      <w:r>
+        <w:t>4.1 Browsing the Game Feed</w:t>
+      </w:r>
+    </w:p>
+    <w:p>
+      <w:r>
+        <w:t>Navigate to the Feed to see all upcoming games. Each game card displays:</w:t>
+      </w:r>
+    </w:p>
+    <w:p>
+      <w:pPr>
+        <w:pStyle w:val="ListBullet"/>
+      </w:pPr>
+      <w:r>
+        <w:t>**Title &amp; Venue**</w:t>
+      </w:r>
+    </w:p>
+    <w:p>
+      <w:pPr>
+        <w:pStyle w:val="ListBullet"/>
+      </w:pPr>
+      <w:r>
+        <w:t>**Date &amp; Time**</w:t>
+      </w:r>
+    </w:p>
+    <w:p>
+      <w:pPr>
+        <w:pStyle w:val="ListBullet"/>
+      </w:pPr>
+      <w:r>
+        <w:t>**Available Slots:** Real-time count of confirmed spots remaining.</w:t>
+      </w:r>
+    </w:p>
+    <w:p>
+      <w:pPr>
+        <w:pStyle w:val="ListBullet"/>
+      </w:pPr>
+      <w:r>
+        <w:t>**Price:** The fee to join the game.</w:t>
+      </w:r>
+    </w:p>
+    <w:p>
+      <w:pPr>
+        <w:pStyle w:val="Heading3"/>
+      </w:pPr>
+      <w:r>
+        <w:t>4.2 Joining a Game</w:t>
+      </w:r>
+    </w:p>
+    <w:p>
+      <w:pPr>
+        <w:pStyle w:val="ListNumber"/>
+      </w:pPr>
+      <w:r>
+        <w:t>Click on a game to view the **Game Details** page.</w:t>
+      </w:r>
+    </w:p>
+    <w:p>
+      <w:pPr>
+        <w:pStyle w:val="ListNumber"/>
+      </w:pPr>
+      <w:r>
+        <w:t>Review the game description and current roster.</w:t>
+      </w:r>
+    </w:p>
+    <w:p>
+      <w:r>
+        <w:t>3. Click Join Game.</w:t>
+      </w:r>
+    </w:p>
+    <w:p>
+      <w:r>
+        <w:t>4. Select your team (Team A or Team B).</w:t>
+      </w:r>
+    </w:p>
+    <w:p>
+      <w:r>
+        <w:t>5. Your status will initially be set to Pending.</w:t>
+      </w:r>
+    </w:p>
+    <w:p>
+      <w:pPr>
+        <w:pStyle w:val="Heading3"/>
+      </w:pPr>
+      <w:r>
+        <w:t>4.3 Payment &amp; Receipt Upload</w:t>
+      </w:r>
+    </w:p>
+    <w:p>
+      <w:r>
+        <w:t>To confirm your spot, you must complete the payment:</w:t>
+      </w:r>
+    </w:p>
+    <w:p>
+      <w:pPr>
+        <w:pStyle w:val="ListNumber"/>
+      </w:pPr>
+      <w:r>
+        <w:t>Locate the **Payment QR Code** on the Game Details page.</w:t>
+      </w:r>
+    </w:p>
+    <w:p>
+      <w:pPr>
+        <w:pStyle w:val="ListNumber"/>
+      </w:pPr>
+      <w:r>
+        <w:t>Scan the code with your banking or e-wallet app and complete the transfer.</w:t>
+      </w:r>
+    </w:p>
+    <w:p>
+      <w:r>
+        <w:t>3. Take a screenshot of your Payment Receipt.</w:t>
+      </w:r>
+    </w:p>
+    <w:p>
+      <w:r>
+        <w:t>4. Click Upload Receipt on the Game Details page and select your screenshot.</w:t>
+      </w:r>
+    </w:p>
+    <w:p>
+      <w:r>
+        <w:t>5. Your status will change to Awaiting Approval. Once the organizer confirms your payment, your status becomes Confirmed and you are officially in the game!</w:t>
+      </w:r>
+    </w:p>
+    <w:p>
+      <w:pPr>
+        <w:pStyle w:val="Heading3"/>
+      </w:pPr>
+      <w:r>
+        <w:t>4.4 Withdrawing from a Game</w:t>
+      </w:r>
+    </w:p>
+    <w:p>
+      <w:r>
+        <w:t>If you can no longer make it, you can click Leave Game on the Game Details page. Note that refund policies are managed by the individual game organizer.</w:t>
+      </w:r>
+    </w:p>
+    <w:p>
+      <w:pPr>
+        <w:pStyle w:val="Heading2"/>
+      </w:pPr>
+      <w:r>
+        <w:t>5. Player Dashboard &amp; Profile</w:t>
+      </w:r>
+    </w:p>
+    <w:p>
+      <w:pPr>
+        <w:pStyle w:val="Heading3"/>
+      </w:pPr>
+      <w:r>
+        <w:t>5.1 Performance Analytics</w:t>
+      </w:r>
+    </w:p>
+    <w:p>
+      <w:r>
+        <w:t>Your personal dashboard shows your progress across all games you've played:</w:t>
+      </w:r>
+    </w:p>
+    <w:p>
+      <w:pPr>
+        <w:pStyle w:val="ListBullet"/>
+      </w:pPr>
+      <w:r>
+        <w:t>**Match Stats:** Goals, assists, and minutes played.</w:t>
+      </w:r>
+    </w:p>
+    <w:p>
+      <w:pPr>
+        <w:pStyle w:val="ListBullet"/>
+      </w:pPr>
+      <w:r>
+        <w:t>**Performance Rating:** A visual chart showing your recent form based on organizer ratings.</w:t>
+      </w:r>
+    </w:p>
+    <w:p>
+      <w:pPr>
+        <w:pStyle w:val="ListBullet"/>
+      </w:pPr>
+      <w:r>
+        <w:t>**Attribute Wheel:** A breakdown of your skills (Pace, Shooting, Passing, Dribbling, Defending, Physical).</w:t>
+      </w:r>
+    </w:p>
+    <w:p>
+      <w:pPr>
+        <w:pStyle w:val="Heading3"/>
+      </w:pPr>
+      <w:r>
+        <w:t>5.2 Profile Customization</w:t>
+      </w:r>
+    </w:p>
+    <w:p>
+      <w:r>
+        <w:t>You can personalize your presence in the community:</w:t>
+      </w:r>
+    </w:p>
+    <w:p>
+      <w:pPr>
+        <w:pStyle w:val="ListBullet"/>
+      </w:pPr>
+      <w:r>
+        <w:t>**Avatar:** Upload a profile picture so others can recognize you.</w:t>
+      </w:r>
+    </w:p>
+    <w:p>
+      <w:pPr>
+        <w:pStyle w:val="ListBullet"/>
+      </w:pPr>
+      <w:r>
+        <w:t>**Profile Info:** Update your preferred position, height, weight, and strong foot.</w:t>
+      </w:r>
+    </w:p>
+    <w:p>
+      <w:pPr>
+        <w:pStyle w:val="Heading3"/>
+      </w:pPr>
+      <w:r>
+        <w:t>5.3 Member Directory</w:t>
+      </w:r>
+    </w:p>
+    <w:p>
+      <w:r>
+        <w:t>Use the Members section to find other players, view their public profiles, and see their stats. It’s a great way to discover talent and connect with the community.</w:t>
+      </w:r>
+    </w:p>
+    <w:p>
+      <w:pPr>
+        <w:pStyle w:val="Heading2"/>
+      </w:pPr>
+      <w:r>
+        <w:t>6. For Organizers: Managing Games</w:t>
+      </w:r>
+    </w:p>
+    <w:p>
+      <w:r>
+        <w:t>If you are a Club Owner or organizer, you have access to specialized management tools.</w:t>
+      </w:r>
+    </w:p>
+    <w:p>
+      <w:pPr>
+        <w:pStyle w:val="Heading3"/>
+      </w:pPr>
+      <w:r>
+        <w:t>6.1 Creating a Game</w:t>
+      </w:r>
+    </w:p>
+    <w:p>
+      <w:pPr>
+        <w:pStyle w:val="ListNumber"/>
+      </w:pPr>
+      <w:r>
+        <w:t>Navigate to **Create Game** in your dashboard.</w:t>
+      </w:r>
+    </w:p>
+    <w:p>
+      <w:pPr>
+        <w:pStyle w:val="ListNumber"/>
+      </w:pPr>
+      <w:r>
+        <w:t>Fill in the logistics: Title, Venue, Date, Time, and Team Names.</w:t>
+      </w:r>
+    </w:p>
+    <w:p>
+      <w:r>
+        <w:t>3. Set the Total Slots and the Price per player.</w:t>
+      </w:r>
+    </w:p>
+    <w:p>
+      <w:r>
+        <w:t>4. Important: Upload your Payment QR Code so players know where to send their fees.</w:t>
+      </w:r>
+    </w:p>
+    <w:p>
+      <w:r>
+        <w:t>5. Click Create Game to make it public.</w:t>
+      </w:r>
+    </w:p>
+    <w:p>
+      <w:pPr>
+        <w:pStyle w:val="Heading3"/>
+      </w:pPr>
+      <w:r>
+        <w:t>6.2 Booking Approval Flow</w:t>
+      </w:r>
+    </w:p>
+    <w:p>
+      <w:r>
+        <w:t>As players join and upload receipts, you must manage their bookings:</w:t>
+      </w:r>
+    </w:p>
+    <w:p>
+      <w:pPr>
+        <w:pStyle w:val="ListNumber"/>
+      </w:pPr>
+      <w:r>
+        <w:t>Go to the **Game Details** page for your game.</w:t>
+      </w:r>
+    </w:p>
+    <w:p>
+      <w:pPr>
+        <w:pStyle w:val="ListNumber"/>
+      </w:pPr>
+      <w:r>
+        <w:t>View the **Bookings List**. Players with uploaded receipts will appear at the top as **Awaiting Approval**.</w:t>
+      </w:r>
+    </w:p>
+    <w:p>
+      <w:r>
+        <w:t>3. Review the uploaded receipt image.</w:t>
+      </w:r>
+    </w:p>
+    <w:p>
+      <w:r>
+        <w:t>4. Click Approve to confirm their spot (this decrements the available slots) or Reject if the receipt is invalid.</w:t>
+      </w:r>
+    </w:p>
+    <w:p>
+      <w:pPr>
+        <w:pStyle w:val="Heading3"/>
+      </w:pPr>
+      <w:r>
+        <w:t>6.3 Cancelling a Game</w:t>
+      </w:r>
+    </w:p>
+    <w:p>
+      <w:r>
+        <w:t>If a game cannot proceed, you can use the Cancel Game option. This will notify all joined players and mark the game as cancelled in the feed.</w:t>
+      </w:r>
+    </w:p>
+    <w:p>
+      <w:pPr>
+        <w:pStyle w:val="Heading3"/>
+      </w:pPr>
+      <w:r>
+        <w:t>6.4 Community Announcements</w:t>
+      </w:r>
+    </w:p>
+    <w:p>
+      <w:r>
+        <w:t>Organizers can post Announcements to the community feed. Use this for general updates, rules, or news that isn't specific to a single game.</w:t>
+      </w:r>
+    </w:p>
+    <w:p>
+      <w:pPr>
+        <w:pStyle w:val="Heading3"/>
+      </w:pPr>
+      <w:r>
+        <w:t>6.5 Organizer Analytics</w:t>
+      </w:r>
+    </w:p>
+    <w:p>
+      <w:r>
+        <w:t>Access the Analytics dashboard to see the health of your community:</w:t>
+      </w:r>
+    </w:p>
+    <w:p>
+      <w:pPr>
+        <w:pStyle w:val="ListBullet"/>
+      </w:pPr>
+      <w:r>
+        <w:t>**Total Revenue:** Summary of collected fees.</w:t>
+      </w:r>
+    </w:p>
+    <w:p>
+      <w:pPr>
+        <w:pStyle w:val="ListBullet"/>
+      </w:pPr>
+      <w:r>
+        <w:t>**Player Growth:** Tracking new members.</w:t>
+      </w:r>
+    </w:p>
+    <w:p>
+      <w:pPr>
+        <w:pStyle w:val="ListBullet"/>
+      </w:pPr>
+      <w:r>
+        <w:t>**Game Activity:** Stats on how many games are being filled.</w:t>
+      </w:r>
+    </w:p>
+    <w:p>
+      <w:pPr>
+        <w:pStyle w:val="Heading2"/>
+      </w:pPr>
+      <w:r>
+        <w:t>7. Payments Summary</w:t>
+      </w:r>
+    </w:p>
+    <w:tbl>
+      <w:tblPr>
+        <w:tblStyle w:val="TableGrid"/>
+        <w:tblW w:type="auto" w:w="0"/>
+        <w:tblLook w:firstColumn="1" w:firstRow="1" w:lastColumn="0" w:lastRow="0" w:noHBand="0" w:noVBand="1" w:val="04A0"/>
+      </w:tblPr>
+      <w:tblGrid>
+        <w:gridCol w:w="2880"/>
+        <w:gridCol w:w="2880"/>
+        <w:gridCol w:w="2880"/>
+      </w:tblGrid>
+      <w:tr>
+        <w:tc>
+          <w:tcPr>
+            <w:tcW w:type="dxa" w:w="2880"/>
+          </w:tcPr>
+          <w:p>
+            <w:r>
+              <w:t>Type</w:t>
             </w:r>
           </w:p>
         </w:tc>
         <w:tc>
           <w:tcPr>
-            <w:tcW w:type="dxa" w:w="5472"/>
-            <w:shd w:val="clear" w:color="auto" w:fill="F5F7FB"/>
-            <w:vAlign w:val="center"/>
+            <w:tcW w:type="dxa" w:w="2880"/>
           </w:tcPr>
           <w:p>
-            <w:pPr>
-              <w:spacing w:before="60" w:after="60"/>
-            </w:pPr>
             <w:r>
-              <w:rPr>
-                <w:color w:val="1A1A2E"/>
-                <w:sz w:val="20"/>
-              </w:rPr>
-              <w:t>View own performance, see announcements &amp; schedule, make monthly subscription payments</w:t>
+              <w:t>Process</w:t>
+            </w:r>
+          </w:p>
+        </w:tc>
+        <w:tc>
+          <w:tcPr>
+            <w:tcW w:type="dxa" w:w="2880"/>
+          </w:tcPr>
+          <w:p>
+            <w:r>
+              <w:t>Confirmation</w:t>
             </w:r>
           </w:p>
         </w:tc>
@@ -592,3411 +827,107 @@
       <w:tr>
         <w:tc>
           <w:tcPr>
-            <w:tcW w:type="dxa" w:w="2160"/>
-            <w:shd w:val="clear" w:color="auto" w:fill="FFFFFF"/>
-            <w:vAlign w:val="center"/>
+            <w:tcW w:type="dxa" w:w="2880"/>
           </w:tcPr>
           <w:p>
-            <w:pPr>
-              <w:spacing w:before="60" w:after="60"/>
-            </w:pPr>
             <w:r>
-              <w:rPr>
-                <w:color w:val="1A1A2E"/>
-                <w:sz w:val="20"/>
-              </w:rPr>
-              <w:t>Pending Player</w:t>
+              <w:t>**Game Fees**</w:t>
             </w:r>
           </w:p>
         </w:tc>
         <w:tc>
           <w:tcPr>
-            <w:tcW w:type="dxa" w:w="2016"/>
-            <w:shd w:val="clear" w:color="auto" w:fill="FFFFFF"/>
-            <w:vAlign w:val="center"/>
+            <w:tcW w:type="dxa" w:w="2880"/>
           </w:tcPr>
           <w:p>
-            <w:pPr>
-              <w:spacing w:before="60" w:after="60"/>
-            </w:pPr>
             <w:r>
-              <w:rPr>
-                <w:color w:val="1A1A2E"/>
-                <w:sz w:val="20"/>
-              </w:rPr>
-              <w:t>Club</w:t>
+              <w:t>Manual (Scan QR Code)</w:t>
             </w:r>
           </w:p>
         </w:tc>
         <w:tc>
           <w:tcPr>
-            <w:tcW w:type="dxa" w:w="5472"/>
-            <w:shd w:val="clear" w:color="auto" w:fill="FFFFFF"/>
-            <w:vAlign w:val="center"/>
+            <w:tcW w:type="dxa" w:w="2880"/>
           </w:tcPr>
           <w:p>
-            <w:pPr>
-              <w:spacing w:before="60" w:after="60"/>
-            </w:pPr>
             <w:r>
-              <w:rPr>
-                <w:color w:val="1A1A2E"/>
-                <w:sz w:val="20"/>
-              </w:rPr>
-              <w:t>Awaiting coach approval after registration; limited access</w:t>
-            </w:r>
-          </w:p>
-        </w:tc>
-      </w:tr>
-      <w:tr>
-        <w:tc>
-          <w:tcPr>
-            <w:tcW w:type="dxa" w:w="2160"/>
-            <w:shd w:val="clear" w:color="auto" w:fill="F5F7FB"/>
-            <w:vAlign w:val="center"/>
-          </w:tcPr>
-          <w:p>
-            <w:pPr>
-              <w:spacing w:before="60" w:after="60"/>
-            </w:pPr>
-            <w:r>
-              <w:rPr>
-                <w:color w:val="1A1A2E"/>
-                <w:sz w:val="20"/>
-              </w:rPr>
-              <w:t>Community Player</w:t>
-            </w:r>
-          </w:p>
-        </w:tc>
-        <w:tc>
-          <w:tcPr>
-            <w:tcW w:type="dxa" w:w="2016"/>
-            <w:shd w:val="clear" w:color="auto" w:fill="F5F7FB"/>
-            <w:vAlign w:val="center"/>
-          </w:tcPr>
-          <w:p>
-            <w:pPr>
-              <w:spacing w:before="60" w:after="60"/>
-            </w:pPr>
-            <w:r>
-              <w:rPr>
-                <w:color w:val="1A1A2E"/>
-                <w:sz w:val="20"/>
-              </w:rPr>
-              <w:t>Community</w:t>
-            </w:r>
-          </w:p>
-        </w:tc>
-        <w:tc>
-          <w:tcPr>
-            <w:tcW w:type="dxa" w:w="5472"/>
-            <w:shd w:val="clear" w:color="auto" w:fill="F5F7FB"/>
-            <w:vAlign w:val="center"/>
-          </w:tcPr>
-          <w:p>
-            <w:pPr>
-              <w:spacing w:before="60" w:after="60"/>
-            </w:pPr>
-            <w:r>
-              <w:rPr>
-                <w:color w:val="1A1A2E"/>
-                <w:sz w:val="20"/>
-              </w:rPr>
-              <w:t>Browse games, join teams, submit payment receipts</w:t>
-            </w:r>
-          </w:p>
-        </w:tc>
-      </w:tr>
-      <w:tr>
-        <w:tc>
-          <w:tcPr>
-            <w:tcW w:type="dxa" w:w="2160"/>
-            <w:shd w:val="clear" w:color="auto" w:fill="FFFFFF"/>
-            <w:vAlign w:val="center"/>
-          </w:tcPr>
-          <w:p>
-            <w:pPr>
-              <w:spacing w:before="60" w:after="60"/>
-            </w:pPr>
-            <w:r>
-              <w:rPr>
-                <w:color w:val="1A1A2E"/>
-                <w:sz w:val="20"/>
-              </w:rPr>
-              <w:t>Community Admin</w:t>
-            </w:r>
-          </w:p>
-        </w:tc>
-        <w:tc>
-          <w:tcPr>
-            <w:tcW w:type="dxa" w:w="2016"/>
-            <w:shd w:val="clear" w:color="auto" w:fill="FFFFFF"/>
-            <w:vAlign w:val="center"/>
-          </w:tcPr>
-          <w:p>
-            <w:pPr>
-              <w:spacing w:before="60" w:after="60"/>
-            </w:pPr>
-            <w:r>
-              <w:rPr>
-                <w:color w:val="1A1A2E"/>
-                <w:sz w:val="20"/>
-              </w:rPr>
-              <w:t>Community</w:t>
-            </w:r>
-          </w:p>
-        </w:tc>
-        <w:tc>
-          <w:tcPr>
-            <w:tcW w:type="dxa" w:w="5472"/>
-            <w:shd w:val="clear" w:color="auto" w:fill="FFFFFF"/>
-            <w:vAlign w:val="center"/>
-          </w:tcPr>
-          <w:p>
-            <w:pPr>
-              <w:spacing w:before="60" w:after="60"/>
-            </w:pPr>
-            <w:r>
-              <w:rPr>
-                <w:color w:val="1A1A2E"/>
-                <w:sz w:val="20"/>
-              </w:rPr>
-              <w:t>Create games, post community announcements, view analytics</w:t>
+              <w:t>Receipt Upload -&gt; Organizer Approval</w:t>
             </w:r>
           </w:p>
         </w:tc>
       </w:tr>
     </w:tbl>
-    <w:p/>
     <w:p>
-      <w:pPr>
-        <w:spacing w:before="360" w:after="80"/>
-        <w:jc w:val="left"/>
-      </w:pPr>
       <w:r>
-        <w:rPr>
-          <w:b/>
-          <w:color w:val="0D1B3E"/>
-          <w:sz w:val="44"/>
-        </w:rPr>
-        <w:t>3.  Getting Started</w:t>
+        <w:t>*Note: All payments are handled directly between the player and the organizer via the provided QR code. NUVRA provides the platform for tracking and approval but does not process the funds directly.*</w:t>
       </w:r>
     </w:p>
     <w:p>
       <w:pPr>
-        <w:pBdr>
-          <w:bottom w:val="single" w:sz="6" w:space="1" w:color="16A34A"/>
-        </w:pBdr>
-        <w:spacing w:before="0" w:after="0"/>
-      </w:pPr>
-    </w:p>
-    <w:p>
-      <w:pPr>
-        <w:spacing w:before="280" w:after="60"/>
+        <w:pStyle w:val="Heading2"/>
       </w:pPr>
       <w:r>
-        <w:rPr>
-          <w:b/>
-          <w:color w:val="0D1B3E"/>
-          <w:sz w:val="30"/>
-        </w:rPr>
-        <w:t>3.1  Club Portal — Registration &amp; Login</w:t>
+        <w:t>8. Frequently Asked Questions (FAQ)</w:t>
       </w:r>
     </w:p>
     <w:p>
-      <w:pPr>
-        <w:spacing w:before="200" w:after="40"/>
-      </w:pPr>
       <w:r>
-        <w:rPr>
-          <w:b/>
-          <w:color w:val="16A34A"/>
-          <w:sz w:val="24"/>
-        </w:rPr>
-        <w:t>Registering as a New Player</w:t>
+        <w:t>Q: Do I need a separate account for "Club" and "Community"?</w:t>
       </w:r>
     </w:p>
     <w:p>
-      <w:pPr>
-        <w:spacing w:before="40" w:after="80"/>
-      </w:pPr>
       <w:r>
-        <w:rPr>
-          <w:i w:val="0"/>
-          <w:color w:val="1A1A2E"/>
-          <w:sz w:val="21"/>
-        </w:rPr>
-        <w:t>Navigate to the main NUVRA website. The default landing page is the Club Portal.</w:t>
+        <w:t>A: No. NUVRA is now a unified platform. One account gives you access to everything.</w:t>
       </w:r>
     </w:p>
     <w:p>
-      <w:pPr>
-        <w:pStyle w:val="ListNumber"/>
-        <w:spacing w:before="40" w:after="40"/>
-        <w:ind w:left="432"/>
-      </w:pPr>
       <w:r>
-        <w:rPr>
-          <w:color w:val="1A1A2E"/>
-          <w:sz w:val="21"/>
-        </w:rPr>
-        <w:t>Click Register on the login page.</w:t>
+        <w:t>Q: Why is my status "Awaiting Approval" after I uploaded my receipt?</w:t>
       </w:r>
     </w:p>
     <w:p>
-      <w:pPr>
-        <w:pStyle w:val="ListNumber"/>
-        <w:spacing w:before="40" w:after="40"/>
-        <w:ind w:left="432"/>
-      </w:pPr>
       <w:r>
-        <w:rPr>
-          <w:color w:val="1A1A2E"/>
-          <w:sz w:val="21"/>
-        </w:rPr>
-        <w:t>Enter your name, email address, and password.</w:t>
+        <w:t>A: The game organizer must manually verify your receipt. Please allow some time for them to review it. Once approved, you'll see your status change to "Confirmed".</w:t>
       </w:r>
     </w:p>
     <w:p>
-      <w:pPr>
-        <w:pStyle w:val="ListNumber"/>
-        <w:spacing w:before="40" w:after="40"/>
-        <w:ind w:left="432"/>
-      </w:pPr>
       <w:r>
-        <w:rPr>
-          <w:color w:val="1A1A2E"/>
-          <w:sz w:val="21"/>
-        </w:rPr>
-        <w:t>Click Sign Up.</w:t>
+        <w:t>Q: How do I become an organizer?</w:t>
       </w:r>
     </w:p>
     <w:p>
-      <w:pPr>
-        <w:pStyle w:val="ListNumber"/>
-        <w:spacing w:before="40" w:after="40"/>
-        <w:ind w:left="432"/>
-      </w:pPr>
       <w:r>
-        <w:rPr>
-          <w:b/>
-          <w:color w:val="1A1A2E"/>
-          <w:sz w:val="21"/>
-        </w:rPr>
-        <w:t xml:space="preserve">Complete profile — </w:t>
-      </w:r>
-      <w:r>
-        <w:rPr>
-          <w:color w:val="1A1A2E"/>
-          <w:sz w:val="21"/>
-        </w:rPr>
-        <w:t>You will be redirected to the Onboarding page. Complete your player profile:</w:t>
+        <w:t>A: Users with the `club_owner` role can create games. If you wish to organize games, please contact the platform administrator to have your role updated.</w:t>
       </w:r>
     </w:p>
     <w:p>
-      <w:pPr>
-        <w:pStyle w:val="ListBullet"/>
-        <w:spacing w:before="20" w:after="20"/>
-        <w:ind w:left="432"/>
-      </w:pPr>
       <w:r>
-        <w:rPr>
-          <w:color w:val="1A1A2E"/>
-          <w:sz w:val="21"/>
-        </w:rPr>
-        <w:t>Select your team (the coach/team you belong to)</w:t>
+        <w:t>Q: Can I change my team after joining?</w:t>
       </w:r>
     </w:p>
     <w:p>
-      <w:pPr>
-        <w:pStyle w:val="ListBullet"/>
-        <w:spacing w:before="20" w:after="20"/>
-        <w:ind w:left="432"/>
-      </w:pPr>
       <w:r>
-        <w:rPr>
-          <w:color w:val="1A1A2E"/>
-          <w:sz w:val="21"/>
-        </w:rPr>
-        <w:t>Choose your playing position (Goalkeeper, Defender, Midfielder, Forward)</w:t>
+        <w:t>A: To change teams, you must first leave the game and then re-join selecting the other team (if slots are available).</w:t>
       </w:r>
     </w:p>
     <w:p>
-      <w:pPr>
-        <w:pStyle w:val="ListBullet"/>
-        <w:spacing w:before="20" w:after="20"/>
-        <w:ind w:left="432"/>
-      </w:pPr>
       <w:r>
-        <w:rPr>
-          <w:color w:val="1A1A2E"/>
-          <w:sz w:val="21"/>
-        </w:rPr>
-        <w:t>Enter your date of birth</w:t>
+        <w:t>Q: My stats haven't updated after a game. What's wrong?</w:t>
       </w:r>
     </w:p>
     <w:p>
-      <w:pPr>
-        <w:pStyle w:val="ListBullet"/>
-        <w:spacing w:before="20" w:after="20"/>
-        <w:ind w:left="432"/>
-      </w:pPr>
       <w:r>
-        <w:rPr>
-          <w:color w:val="1A1A2E"/>
-          <w:sz w:val="21"/>
-        </w:rPr>
-        <w:t>Enter your jersey number</w:t>
+        <w:t>A: Stats are recorded by the organizer after the game is completed. If your stats are missing, reach out to the game organizer.</w:t>
       </w:r>
     </w:p>
     <w:p>
-      <w:pPr>
-        <w:pStyle w:val="ListNumber"/>
-        <w:spacing w:before="40" w:after="40"/>
-        <w:ind w:left="432"/>
-      </w:pPr>
       <w:r>
-        <w:rPr>
-          <w:color w:val="1A1A2E"/>
-          <w:sz w:val="21"/>
-        </w:rPr>
-        <w:t>After submitting, your account status will be Pending. Your coach must approve you before you gain full access.</w:t>
-      </w:r>
-    </w:p>
-    <w:p>
-      <w:pPr>
-        <w:pStyle w:val="ListNumber"/>
-        <w:spacing w:before="40" w:after="40"/>
-        <w:ind w:left="432"/>
-      </w:pPr>
-      <w:r>
-        <w:rPr>
-          <w:color w:val="1A1A2E"/>
-          <w:sz w:val="21"/>
-        </w:rPr>
-        <w:t>You will see a Waiting Room page while your approval is being processed.</w:t>
-      </w:r>
-    </w:p>
-    <w:p>
-      <w:pPr>
-        <w:spacing w:before="80" w:after="120"/>
-        <w:ind w:left="360"/>
-        <w:shd w:val="clear" w:color="auto" w:fill="EEF4FF"/>
-      </w:pPr>
-      <w:r>
-        <w:rPr>
-          <w:b/>
-          <w:color w:val="0D1B3E"/>
-          <w:sz w:val="20"/>
-        </w:rPr>
-        <w:t xml:space="preserve">  Note:  </w:t>
-      </w:r>
-      <w:r>
-        <w:rPr>
-          <w:i/>
-          <w:color w:val="556581"/>
-          <w:sz w:val="20"/>
-        </w:rPr>
-        <w:t>You can also register and log in using your Google account by clicking Continue with Google. New Google users will still complete the onboarding step above.</w:t>
-      </w:r>
-    </w:p>
-    <w:p>
-      <w:pPr>
-        <w:spacing w:before="200" w:after="40"/>
-      </w:pPr>
-      <w:r>
-        <w:rPr>
-          <w:b/>
-          <w:color w:val="16A34A"/>
-          <w:sz w:val="24"/>
-        </w:rPr>
-        <w:t>Logging In as a Returning User</w:t>
-      </w:r>
-    </w:p>
-    <w:p>
-      <w:pPr>
-        <w:pStyle w:val="ListNumber"/>
-        <w:spacing w:before="40" w:after="40"/>
-        <w:ind w:left="432"/>
-      </w:pPr>
-      <w:r>
-        <w:rPr>
-          <w:color w:val="1A1A2E"/>
-          <w:sz w:val="21"/>
-        </w:rPr>
-        <w:t>Enter your registered email and password.</w:t>
-      </w:r>
-    </w:p>
-    <w:p>
-      <w:pPr>
-        <w:pStyle w:val="ListNumber"/>
-        <w:spacing w:before="40" w:after="40"/>
-        <w:ind w:left="432"/>
-      </w:pPr>
-      <w:r>
-        <w:rPr>
-          <w:color w:val="1A1A2E"/>
-          <w:sz w:val="21"/>
-        </w:rPr>
-        <w:t>Click Login.</w:t>
-      </w:r>
-    </w:p>
-    <w:p>
-      <w:pPr>
-        <w:pStyle w:val="ListNumber"/>
-        <w:spacing w:before="40" w:after="40"/>
-        <w:ind w:left="432"/>
-      </w:pPr>
-      <w:r>
-        <w:rPr>
-          <w:color w:val="1A1A2E"/>
-          <w:sz w:val="21"/>
-        </w:rPr>
-        <w:t>You will be directed to your dashboard based on your role (Coach or Player).</w:t>
-      </w:r>
-    </w:p>
-    <w:p>
-      <w:pPr>
-        <w:spacing w:before="200" w:after="40"/>
-      </w:pPr>
-      <w:r>
-        <w:rPr>
-          <w:b/>
-          <w:color w:val="16A34A"/>
-          <w:sz w:val="24"/>
-        </w:rPr>
-        <w:t>Forgot Password</w:t>
-      </w:r>
-    </w:p>
-    <w:p>
-      <w:pPr>
-        <w:pStyle w:val="ListNumber"/>
-        <w:spacing w:before="40" w:after="40"/>
-        <w:ind w:left="432"/>
-      </w:pPr>
-      <w:r>
-        <w:rPr>
-          <w:color w:val="1A1A2E"/>
-          <w:sz w:val="21"/>
-        </w:rPr>
-        <w:t>On the login page, click Forgot Password.</w:t>
-      </w:r>
-    </w:p>
-    <w:p>
-      <w:pPr>
-        <w:pStyle w:val="ListNumber"/>
-        <w:spacing w:before="40" w:after="40"/>
-        <w:ind w:left="432"/>
-      </w:pPr>
-      <w:r>
-        <w:rPr>
-          <w:color w:val="1A1A2E"/>
-          <w:sz w:val="21"/>
-        </w:rPr>
-        <w:t>Enter your registered email address.</w:t>
-      </w:r>
-    </w:p>
-    <w:p>
-      <w:pPr>
-        <w:pStyle w:val="ListNumber"/>
-        <w:spacing w:before="40" w:after="40"/>
-        <w:ind w:left="432"/>
-      </w:pPr>
-      <w:r>
-        <w:rPr>
-          <w:color w:val="1A1A2E"/>
-          <w:sz w:val="21"/>
-        </w:rPr>
-        <w:t>Check your inbox for a password reset link.</w:t>
-      </w:r>
-    </w:p>
-    <w:p>
-      <w:pPr>
-        <w:pStyle w:val="ListNumber"/>
-        <w:spacing w:before="40" w:after="40"/>
-        <w:ind w:left="432"/>
-      </w:pPr>
-      <w:r>
-        <w:rPr>
-          <w:color w:val="1A1A2E"/>
-          <w:sz w:val="21"/>
-        </w:rPr>
-        <w:t>Follow the link to set a new password.</w:t>
-      </w:r>
-    </w:p>
-    <w:p>
-      <w:pPr>
-        <w:spacing w:before="280" w:after="60"/>
-      </w:pPr>
-      <w:r>
-        <w:rPr>
-          <w:b/>
-          <w:color w:val="0D1B3E"/>
-          <w:sz w:val="30"/>
-        </w:rPr>
-        <w:t>3.2  Community Portal — Registration &amp; Login</w:t>
-      </w:r>
-    </w:p>
-    <w:p>
-      <w:pPr>
-        <w:spacing w:before="40" w:after="80"/>
-      </w:pPr>
-      <w:r>
-        <w:rPr>
-          <w:i w:val="0"/>
-          <w:color w:val="1A1A2E"/>
-          <w:sz w:val="21"/>
-        </w:rPr>
-        <w:t>From the main NUVRA site, navigate to the Community section (separate from the Club Portal).</w:t>
-      </w:r>
-    </w:p>
-    <w:p>
-      <w:pPr>
-        <w:spacing w:before="200" w:after="40"/>
-      </w:pPr>
-      <w:r>
-        <w:rPr>
-          <w:b/>
-          <w:color w:val="16A34A"/>
-          <w:sz w:val="24"/>
-        </w:rPr>
-        <w:t>Registering</w:t>
-      </w:r>
-    </w:p>
-    <w:p>
-      <w:pPr>
-        <w:pStyle w:val="ListNumber"/>
-        <w:spacing w:before="40" w:after="40"/>
-        <w:ind w:left="432"/>
-      </w:pPr>
-      <w:r>
-        <w:rPr>
-          <w:color w:val="1A1A2E"/>
-          <w:sz w:val="21"/>
-        </w:rPr>
-        <w:t>Click Register on the Community login page.</w:t>
-      </w:r>
-    </w:p>
-    <w:p>
-      <w:pPr>
-        <w:pStyle w:val="ListNumber"/>
-        <w:spacing w:before="40" w:after="40"/>
-        <w:ind w:left="432"/>
-      </w:pPr>
-      <w:r>
-        <w:rPr>
-          <w:color w:val="1A1A2E"/>
-          <w:sz w:val="21"/>
-        </w:rPr>
-        <w:t>Provide your name, email, and password.</w:t>
-      </w:r>
-    </w:p>
-    <w:p>
-      <w:pPr>
-        <w:pStyle w:val="ListNumber"/>
-        <w:spacing w:before="40" w:after="40"/>
-        <w:ind w:left="432"/>
-      </w:pPr>
-      <w:r>
-        <w:rPr>
-          <w:color w:val="1A1A2E"/>
-          <w:sz w:val="21"/>
-        </w:rPr>
-        <w:t>Click Sign Up — you will be taken directly to the Community feed. No approval is required.</w:t>
-      </w:r>
-    </w:p>
-    <w:p>
-      <w:pPr>
-        <w:spacing w:before="200" w:after="40"/>
-      </w:pPr>
-      <w:r>
-        <w:rPr>
-          <w:b/>
-          <w:color w:val="16A34A"/>
-          <w:sz w:val="24"/>
-        </w:rPr>
-        <w:t>Logging In</w:t>
-      </w:r>
-    </w:p>
-    <w:p>
-      <w:pPr>
-        <w:pStyle w:val="ListNumber"/>
-        <w:spacing w:before="40" w:after="40"/>
-        <w:ind w:left="432"/>
-      </w:pPr>
-      <w:r>
-        <w:rPr>
-          <w:color w:val="1A1A2E"/>
-          <w:sz w:val="21"/>
-        </w:rPr>
-        <w:t>Enter your email and password on the Community login page.</w:t>
-      </w:r>
-    </w:p>
-    <w:p>
-      <w:pPr>
-        <w:pStyle w:val="ListNumber"/>
-        <w:spacing w:before="40" w:after="40"/>
-        <w:ind w:left="432"/>
-      </w:pPr>
-      <w:r>
-        <w:rPr>
-          <w:color w:val="1A1A2E"/>
-          <w:sz w:val="21"/>
-        </w:rPr>
-        <w:t>Click Login to access the Community game feed.</w:t>
-      </w:r>
-    </w:p>
-    <w:p>
-      <w:pPr>
-        <w:spacing w:before="360" w:after="80"/>
-        <w:jc w:val="left"/>
-      </w:pPr>
-      <w:r>
-        <w:rPr>
-          <w:b/>
-          <w:color w:val="0D1B3E"/>
-          <w:sz w:val="44"/>
-        </w:rPr>
-        <w:t>4.  Club Portal — Coach</w:t>
-      </w:r>
-    </w:p>
-    <w:p>
-      <w:pPr>
-        <w:pBdr>
-          <w:bottom w:val="single" w:sz="6" w:space="1" w:color="16A34A"/>
-        </w:pBdr>
-        <w:spacing w:before="0" w:after="0"/>
-      </w:pPr>
-    </w:p>
-    <w:p>
-      <w:pPr>
-        <w:spacing w:before="40" w:after="80"/>
-      </w:pPr>
-      <w:r>
-        <w:rPr>
-          <w:i w:val="0"/>
-          <w:color w:val="1A1A2E"/>
-          <w:sz w:val="21"/>
-        </w:rPr>
-        <w:t>After logging in, coaches land on the Coach Dashboard. The left sidebar provides navigation to all coaching tools.</w:t>
-      </w:r>
-    </w:p>
-    <w:p>
-      <w:pPr>
-        <w:spacing w:before="280" w:after="60"/>
-      </w:pPr>
-      <w:r>
-        <w:rPr>
-          <w:b/>
-          <w:color w:val="0D1B3E"/>
-          <w:sz w:val="30"/>
-        </w:rPr>
-        <w:t>4.1  Squad Management</w:t>
-      </w:r>
-    </w:p>
-    <w:p>
-      <w:pPr>
-        <w:spacing w:before="40" w:after="80"/>
-      </w:pPr>
-      <w:r>
-        <w:rPr>
-          <w:i w:val="0"/>
-          <w:color w:val="1A1A2E"/>
-          <w:sz w:val="21"/>
-        </w:rPr>
-        <w:t>Displays all players registered to your team, including their profile details, position, jersey number, and current approval status.</w:t>
-      </w:r>
-    </w:p>
-    <w:p>
-      <w:pPr>
-        <w:spacing w:before="80" w:after="80"/>
-        <w:jc w:val="left"/>
-      </w:pPr>
-      <w:r>
-        <w:rPr>
-          <w:b/>
-          <w:i w:val="0"/>
-          <w:color w:val="1A1A2E"/>
-          <w:sz w:val="21"/>
-        </w:rPr>
-        <w:t>Key actions:</w:t>
-      </w:r>
-    </w:p>
-    <w:p>
-      <w:pPr>
-        <w:pStyle w:val="ListBullet"/>
-        <w:spacing w:before="20" w:after="20"/>
-        <w:ind w:left="432"/>
-      </w:pPr>
-      <w:r>
-        <w:rPr>
-          <w:color w:val="1A1A2E"/>
-          <w:sz w:val="21"/>
-        </w:rPr>
-        <w:t>View player profiles — click any player to see their full profile, attributes, and performance history.</w:t>
-      </w:r>
-    </w:p>
-    <w:p>
-      <w:pPr>
-        <w:pStyle w:val="ListBullet"/>
-        <w:spacing w:before="20" w:after="20"/>
-        <w:ind w:left="432"/>
-      </w:pPr>
-      <w:r>
-        <w:rPr>
-          <w:color w:val="1A1A2E"/>
-          <w:sz w:val="21"/>
-        </w:rPr>
-        <w:t>Approve or decline pending players — new players who selected your team during onboarding appear here with a Pending badge. Click their profile and choose Approve or Decline.</w:t>
-      </w:r>
-    </w:p>
-    <w:p>
-      <w:pPr>
-        <w:pStyle w:val="ListBullet"/>
-        <w:spacing w:before="20" w:after="20"/>
-        <w:ind w:left="432"/>
-      </w:pPr>
-      <w:r>
-        <w:rPr>
-          <w:color w:val="1A1A2E"/>
-          <w:sz w:val="21"/>
-        </w:rPr>
-        <w:t>Monitor player status — Active or Pending.</w:t>
-      </w:r>
-    </w:p>
-    <w:p>
-      <w:pPr>
-        <w:spacing w:before="280" w:after="60"/>
-      </w:pPr>
-      <w:r>
-        <w:rPr>
-          <w:b/>
-          <w:color w:val="0D1B3E"/>
-          <w:sz w:val="30"/>
-        </w:rPr>
-        <w:t>4.2  Recording Player Stats</w:t>
-      </w:r>
-    </w:p>
-    <w:p>
-      <w:pPr>
-        <w:spacing w:before="40" w:after="80"/>
-      </w:pPr>
-      <w:r>
-        <w:rPr>
-          <w:i w:val="0"/>
-          <w:color w:val="1A1A2E"/>
-          <w:sz w:val="21"/>
-        </w:rPr>
-        <w:t>Allows coaches to log individual player performance for each match.</w:t>
-      </w:r>
-    </w:p>
-    <w:p>
-      <w:pPr>
-        <w:spacing w:before="200" w:after="40"/>
-      </w:pPr>
-      <w:r>
-        <w:rPr>
-          <w:b/>
-          <w:color w:val="16A34A"/>
-          <w:sz w:val="24"/>
-        </w:rPr>
-        <w:t>How to record stats:</w:t>
-      </w:r>
-    </w:p>
-    <w:p>
-      <w:pPr>
-        <w:pStyle w:val="ListNumber"/>
-        <w:spacing w:before="40" w:after="40"/>
-        <w:ind w:left="432"/>
-      </w:pPr>
-      <w:r>
-        <w:rPr>
-          <w:color w:val="1A1A2E"/>
-          <w:sz w:val="21"/>
-        </w:rPr>
-        <w:t>Navigate to Record Stats in the sidebar.</w:t>
-      </w:r>
-    </w:p>
-    <w:p>
-      <w:pPr>
-        <w:pStyle w:val="ListNumber"/>
-        <w:spacing w:before="40" w:after="40"/>
-        <w:ind w:left="432"/>
-      </w:pPr>
-      <w:r>
-        <w:rPr>
-          <w:color w:val="1A1A2E"/>
-          <w:sz w:val="21"/>
-        </w:rPr>
-        <w:t>Select the player from the squad list.</w:t>
-      </w:r>
-    </w:p>
-    <w:p>
-      <w:pPr>
-        <w:pStyle w:val="ListNumber"/>
-        <w:spacing w:before="40" w:after="40"/>
-        <w:ind w:left="432"/>
-      </w:pPr>
-      <w:r>
-        <w:rPr>
-          <w:color w:val="1A1A2E"/>
-          <w:sz w:val="21"/>
-        </w:rPr>
-        <w:t>Fill in match details:</w:t>
-      </w:r>
-    </w:p>
-    <w:p>
-      <w:pPr>
-        <w:pStyle w:val="ListBullet"/>
-        <w:spacing w:before="20" w:after="20"/>
-        <w:ind w:left="432"/>
-      </w:pPr>
-      <w:r>
-        <w:rPr>
-          <w:color w:val="1A1A2E"/>
-          <w:sz w:val="21"/>
-        </w:rPr>
-        <w:t>Opponent name</w:t>
-      </w:r>
-    </w:p>
-    <w:p>
-      <w:pPr>
-        <w:pStyle w:val="ListBullet"/>
-        <w:spacing w:before="20" w:after="20"/>
-        <w:ind w:left="432"/>
-      </w:pPr>
-      <w:r>
-        <w:rPr>
-          <w:color w:val="1A1A2E"/>
-          <w:sz w:val="21"/>
-        </w:rPr>
-        <w:t>Match date and time</w:t>
-      </w:r>
-    </w:p>
-    <w:p>
-      <w:pPr>
-        <w:pStyle w:val="ListBullet"/>
-        <w:spacing w:before="20" w:after="20"/>
-        <w:ind w:left="432"/>
-      </w:pPr>
-      <w:r>
-        <w:rPr>
-          <w:color w:val="1A1A2E"/>
-          <w:sz w:val="21"/>
-        </w:rPr>
-        <w:t>Venue</w:t>
-      </w:r>
-    </w:p>
-    <w:p>
-      <w:pPr>
-        <w:pStyle w:val="ListBullet"/>
-        <w:spacing w:before="20" w:after="20"/>
-        <w:ind w:left="432"/>
-      </w:pPr>
-      <w:r>
-        <w:rPr>
-          <w:color w:val="1A1A2E"/>
-          <w:sz w:val="21"/>
-        </w:rPr>
-        <w:t>League / event type</w:t>
-      </w:r>
-    </w:p>
-    <w:p>
-      <w:pPr>
-        <w:pStyle w:val="ListNumber"/>
-        <w:spacing w:before="40" w:after="40"/>
-        <w:ind w:left="432"/>
-      </w:pPr>
-      <w:r>
-        <w:rPr>
-          <w:color w:val="1A1A2E"/>
-          <w:sz w:val="21"/>
-        </w:rPr>
-        <w:t>Fill in player performance:</w:t>
-      </w:r>
-    </w:p>
-    <w:p>
-      <w:pPr>
-        <w:pStyle w:val="ListBullet"/>
-        <w:spacing w:before="20" w:after="20"/>
-        <w:ind w:left="432"/>
-      </w:pPr>
-      <w:r>
-        <w:rPr>
-          <w:color w:val="1A1A2E"/>
-          <w:sz w:val="21"/>
-        </w:rPr>
-        <w:t>Goals scored</w:t>
-      </w:r>
-    </w:p>
-    <w:p>
-      <w:pPr>
-        <w:pStyle w:val="ListBullet"/>
-        <w:spacing w:before="20" w:after="20"/>
-        <w:ind w:left="432"/>
-      </w:pPr>
-      <w:r>
-        <w:rPr>
-          <w:color w:val="1A1A2E"/>
-          <w:sz w:val="21"/>
-        </w:rPr>
-        <w:t>Assists</w:t>
-      </w:r>
-    </w:p>
-    <w:p>
-      <w:pPr>
-        <w:pStyle w:val="ListBullet"/>
-        <w:spacing w:before="20" w:after="20"/>
-        <w:ind w:left="432"/>
-      </w:pPr>
-      <w:r>
-        <w:rPr>
-          <w:color w:val="1A1A2E"/>
-          <w:sz w:val="21"/>
-        </w:rPr>
-        <w:t>Minutes played</w:t>
-      </w:r>
-    </w:p>
-    <w:p>
-      <w:pPr>
-        <w:pStyle w:val="ListBullet"/>
-        <w:spacing w:before="20" w:after="20"/>
-        <w:ind w:left="432"/>
-      </w:pPr>
-      <w:r>
-        <w:rPr>
-          <w:color w:val="1A1A2E"/>
-          <w:sz w:val="21"/>
-        </w:rPr>
-        <w:t>Performance rating (0–10 scale)</w:t>
-      </w:r>
-    </w:p>
-    <w:p>
-      <w:pPr>
-        <w:pStyle w:val="ListBullet"/>
-        <w:spacing w:before="20" w:after="20"/>
-        <w:ind w:left="432"/>
-      </w:pPr>
-      <w:r>
-        <w:rPr>
-          <w:color w:val="1A1A2E"/>
-          <w:sz w:val="21"/>
-        </w:rPr>
-        <w:t>Clean sheet (Yes / No — relevant for goalkeepers and defenders)</w:t>
-      </w:r>
-    </w:p>
-    <w:p>
-      <w:pPr>
-        <w:pStyle w:val="ListNumber"/>
-        <w:spacing w:before="40" w:after="40"/>
-        <w:ind w:left="432"/>
-      </w:pPr>
-      <w:r>
-        <w:rPr>
-          <w:color w:val="1A1A2E"/>
-          <w:sz w:val="21"/>
-        </w:rPr>
-        <w:t>Click Save to record the stats.</w:t>
-      </w:r>
-    </w:p>
-    <w:p>
-      <w:pPr>
-        <w:spacing w:before="40" w:after="80"/>
-      </w:pPr>
-      <w:r>
-        <w:rPr>
-          <w:i w:val="0"/>
-          <w:color w:val="1A1A2E"/>
-          <w:sz w:val="21"/>
-        </w:rPr>
-        <w:t>These stats feed directly into each player's performance dashboard and analytics charts.</w:t>
-      </w:r>
-    </w:p>
-    <w:p>
-      <w:pPr>
-        <w:spacing w:before="280" w:after="60"/>
-      </w:pPr>
-      <w:r>
-        <w:rPr>
-          <w:b/>
-          <w:color w:val="0D1B3E"/>
-          <w:sz w:val="30"/>
-        </w:rPr>
-        <w:t>4.3  Announcements</w:t>
-      </w:r>
-    </w:p>
-    <w:p>
-      <w:pPr>
-        <w:spacing w:before="40" w:after="80"/>
-      </w:pPr>
-      <w:r>
-        <w:rPr>
-          <w:i w:val="0"/>
-          <w:color w:val="1A1A2E"/>
-          <w:sz w:val="21"/>
-        </w:rPr>
-        <w:t>Allows coaches to post team-wide notices visible to all squad players.</w:t>
-      </w:r>
-    </w:p>
-    <w:p>
-      <w:pPr>
-        <w:spacing w:before="200" w:after="40"/>
-      </w:pPr>
-      <w:r>
-        <w:rPr>
-          <w:b/>
-          <w:color w:val="16A34A"/>
-          <w:sz w:val="24"/>
-        </w:rPr>
-        <w:t>How to post an announcement:</w:t>
-      </w:r>
-    </w:p>
-    <w:p>
-      <w:pPr>
-        <w:pStyle w:val="ListNumber"/>
-        <w:spacing w:before="40" w:after="40"/>
-        <w:ind w:left="432"/>
-      </w:pPr>
-      <w:r>
-        <w:rPr>
-          <w:color w:val="1A1A2E"/>
-          <w:sz w:val="21"/>
-        </w:rPr>
-        <w:t>Navigate to Announcements in the sidebar.</w:t>
-      </w:r>
-    </w:p>
-    <w:p>
-      <w:pPr>
-        <w:pStyle w:val="ListNumber"/>
-        <w:spacing w:before="40" w:after="40"/>
-        <w:ind w:left="432"/>
-      </w:pPr>
-      <w:r>
-        <w:rPr>
-          <w:color w:val="1A1A2E"/>
-          <w:sz w:val="21"/>
-        </w:rPr>
-        <w:t>Click New Announcement.</w:t>
-      </w:r>
-    </w:p>
-    <w:p>
-      <w:pPr>
-        <w:pStyle w:val="ListNumber"/>
-        <w:spacing w:before="40" w:after="40"/>
-        <w:ind w:left="432"/>
-      </w:pPr>
-      <w:r>
-        <w:rPr>
-          <w:color w:val="1A1A2E"/>
-          <w:sz w:val="21"/>
-        </w:rPr>
-        <w:t>Enter a title and the announcement content.</w:t>
-      </w:r>
-    </w:p>
-    <w:p>
-      <w:pPr>
-        <w:pStyle w:val="ListNumber"/>
-        <w:spacing w:before="40" w:after="40"/>
-        <w:ind w:left="432"/>
-      </w:pPr>
-      <w:r>
-        <w:rPr>
-          <w:color w:val="1A1A2E"/>
-          <w:sz w:val="21"/>
-        </w:rPr>
-        <w:t>Click Post — all active players on your team will see it immediately on their dashboard.</w:t>
-      </w:r>
-    </w:p>
-    <w:p>
-      <w:pPr>
-        <w:spacing w:before="40" w:after="80"/>
-      </w:pPr>
-      <w:r>
-        <w:rPr>
-          <w:i w:val="0"/>
-          <w:color w:val="1A1A2E"/>
-          <w:sz w:val="21"/>
-        </w:rPr>
-        <w:t>You can also delete old announcements from the same screen.</w:t>
-      </w:r>
-    </w:p>
-    <w:p>
-      <w:pPr>
-        <w:spacing w:before="280" w:after="60"/>
-      </w:pPr>
-      <w:r>
-        <w:rPr>
-          <w:b/>
-          <w:color w:val="0D1B3E"/>
-          <w:sz w:val="30"/>
-        </w:rPr>
-        <w:t>4.4  Schedule &amp; Calendar</w:t>
-      </w:r>
-    </w:p>
-    <w:p>
-      <w:pPr>
-        <w:spacing w:before="40" w:after="80"/>
-      </w:pPr>
-      <w:r>
-        <w:rPr>
-          <w:i w:val="0"/>
-          <w:color w:val="1A1A2E"/>
-          <w:sz w:val="21"/>
-        </w:rPr>
-        <w:t>Displays and manages upcoming matches and training sessions in a calendar view.</w:t>
-      </w:r>
-    </w:p>
-    <w:p>
-      <w:pPr>
-        <w:spacing w:before="200" w:after="40"/>
-      </w:pPr>
-      <w:r>
-        <w:rPr>
-          <w:b/>
-          <w:color w:val="16A34A"/>
-          <w:sz w:val="24"/>
-        </w:rPr>
-        <w:t>How to add a schedule event:</w:t>
-      </w:r>
-    </w:p>
-    <w:p>
-      <w:pPr>
-        <w:pStyle w:val="ListNumber"/>
-        <w:spacing w:before="40" w:after="40"/>
-        <w:ind w:left="432"/>
-      </w:pPr>
-      <w:r>
-        <w:rPr>
-          <w:color w:val="1A1A2E"/>
-          <w:sz w:val="21"/>
-        </w:rPr>
-        <w:t>Navigate to Schedule in the sidebar.</w:t>
-      </w:r>
-    </w:p>
-    <w:p>
-      <w:pPr>
-        <w:pStyle w:val="ListNumber"/>
-        <w:spacing w:before="40" w:after="40"/>
-        <w:ind w:left="432"/>
-      </w:pPr>
-      <w:r>
-        <w:rPr>
-          <w:color w:val="1A1A2E"/>
-          <w:sz w:val="21"/>
-        </w:rPr>
-        <w:t>Click a date on the calendar or use the Add Event button.</w:t>
-      </w:r>
-    </w:p>
-    <w:p>
-      <w:pPr>
-        <w:pStyle w:val="ListNumber"/>
-        <w:spacing w:before="40" w:after="40"/>
-        <w:ind w:left="432"/>
-      </w:pPr>
-      <w:r>
-        <w:rPr>
-          <w:color w:val="1A1A2E"/>
-          <w:sz w:val="21"/>
-        </w:rPr>
-        <w:t>Enter event details:</w:t>
-      </w:r>
-    </w:p>
-    <w:p>
-      <w:pPr>
-        <w:pStyle w:val="ListBullet"/>
-        <w:spacing w:before="20" w:after="20"/>
-        <w:ind w:left="432"/>
-      </w:pPr>
-      <w:r>
-        <w:rPr>
-          <w:color w:val="1A1A2E"/>
-          <w:sz w:val="21"/>
-        </w:rPr>
-        <w:t>Event title (e.g., "Training Session" or "Match vs XFC")</w:t>
-      </w:r>
-    </w:p>
-    <w:p>
-      <w:pPr>
-        <w:pStyle w:val="ListBullet"/>
-        <w:spacing w:before="20" w:after="20"/>
-        <w:ind w:left="432"/>
-      </w:pPr>
-      <w:r>
-        <w:rPr>
-          <w:color w:val="1A1A2E"/>
-          <w:sz w:val="21"/>
-        </w:rPr>
-        <w:t>Date and time</w:t>
-      </w:r>
-    </w:p>
-    <w:p>
-      <w:pPr>
-        <w:pStyle w:val="ListBullet"/>
-        <w:spacing w:before="20" w:after="20"/>
-        <w:ind w:left="432"/>
-      </w:pPr>
-      <w:r>
-        <w:rPr>
-          <w:color w:val="1A1A2E"/>
-          <w:sz w:val="21"/>
-        </w:rPr>
-        <w:t>Venue / location</w:t>
-      </w:r>
-    </w:p>
-    <w:p>
-      <w:pPr>
-        <w:pStyle w:val="ListBullet"/>
-        <w:spacing w:before="20" w:after="20"/>
-        <w:ind w:left="432"/>
-      </w:pPr>
-      <w:r>
-        <w:rPr>
-          <w:color w:val="1A1A2E"/>
-          <w:sz w:val="21"/>
-        </w:rPr>
-        <w:t>Category (Match / Training)</w:t>
-      </w:r>
-    </w:p>
-    <w:p>
-      <w:pPr>
-        <w:pStyle w:val="ListNumber"/>
-        <w:spacing w:before="40" w:after="40"/>
-        <w:ind w:left="432"/>
-      </w:pPr>
-      <w:r>
-        <w:rPr>
-          <w:color w:val="1A1A2E"/>
-          <w:sz w:val="21"/>
-        </w:rPr>
-        <w:t>Save the event — it will appear on the coach's calendar and on every active player's schedule view.</w:t>
-      </w:r>
-    </w:p>
-    <w:p>
-      <w:pPr>
-        <w:spacing w:before="280" w:after="60"/>
-      </w:pPr>
-      <w:r>
-        <w:rPr>
-          <w:b/>
-          <w:color w:val="0D1B3E"/>
-          <w:sz w:val="30"/>
-        </w:rPr>
-        <w:t>4.5  Payment Overview</w:t>
-      </w:r>
-    </w:p>
-    <w:p>
-      <w:pPr>
-        <w:spacing w:before="40" w:after="80"/>
-      </w:pPr>
-      <w:r>
-        <w:rPr>
-          <w:i w:val="0"/>
-          <w:color w:val="1A1A2E"/>
-          <w:sz w:val="21"/>
-        </w:rPr>
-        <w:t>Gives coaches a read-only summary of which players have paid their monthly subscription fee.</w:t>
-      </w:r>
-    </w:p>
-    <w:p>
-      <w:pPr>
-        <w:spacing w:before="200" w:after="40"/>
-      </w:pPr>
-      <w:r>
-        <w:rPr>
-          <w:b/>
-          <w:color w:val="16A34A"/>
-          <w:sz w:val="24"/>
-        </w:rPr>
-        <w:t>How to use:</w:t>
-      </w:r>
-    </w:p>
-    <w:p>
-      <w:pPr>
-        <w:pStyle w:val="ListNumber"/>
-        <w:spacing w:before="40" w:after="40"/>
-        <w:ind w:left="432"/>
-      </w:pPr>
-      <w:r>
-        <w:rPr>
-          <w:color w:val="1A1A2E"/>
-          <w:sz w:val="21"/>
-        </w:rPr>
-        <w:t>Navigate to Payment in the sidebar.</w:t>
-      </w:r>
-    </w:p>
-    <w:p>
-      <w:pPr>
-        <w:pStyle w:val="ListNumber"/>
-        <w:spacing w:before="40" w:after="40"/>
-        <w:ind w:left="432"/>
-      </w:pPr>
-      <w:r>
-        <w:rPr>
-          <w:color w:val="1A1A2E"/>
-          <w:sz w:val="21"/>
-        </w:rPr>
-        <w:t>Select a month to filter the view.</w:t>
-      </w:r>
-    </w:p>
-    <w:p>
-      <w:pPr>
-        <w:pStyle w:val="ListNumber"/>
-        <w:spacing w:before="40" w:after="40"/>
-        <w:ind w:left="432"/>
-      </w:pPr>
-      <w:r>
-        <w:rPr>
-          <w:color w:val="1A1A2E"/>
-          <w:sz w:val="21"/>
-        </w:rPr>
-        <w:t>The table shows each player and their payment status:</w:t>
-      </w:r>
-    </w:p>
-    <w:p>
-      <w:pPr>
-        <w:pStyle w:val="ListBullet"/>
-        <w:spacing w:before="20" w:after="20"/>
-        <w:ind w:left="432"/>
-      </w:pPr>
-      <w:r>
-        <w:rPr>
-          <w:color w:val="1A1A2E"/>
-          <w:sz w:val="21"/>
-        </w:rPr>
-        <w:t>Completed — payment received</w:t>
-      </w:r>
-    </w:p>
-    <w:p>
-      <w:pPr>
-        <w:pStyle w:val="ListBullet"/>
-        <w:spacing w:before="20" w:after="20"/>
-        <w:ind w:left="432"/>
-      </w:pPr>
-      <w:r>
-        <w:rPr>
-          <w:color w:val="1A1A2E"/>
-          <w:sz w:val="21"/>
-        </w:rPr>
-        <w:t>Pending — payment not yet made</w:t>
-      </w:r>
-    </w:p>
-    <w:p>
-      <w:pPr>
-        <w:spacing w:before="80" w:after="120"/>
-        <w:ind w:left="360"/>
-        <w:shd w:val="clear" w:color="auto" w:fill="EEF4FF"/>
-      </w:pPr>
-      <w:r>
-        <w:rPr>
-          <w:b/>
-          <w:color w:val="0D1B3E"/>
-          <w:sz w:val="20"/>
-        </w:rPr>
-        <w:t xml:space="preserve">  Note:  </w:t>
-      </w:r>
-      <w:r>
-        <w:rPr>
-          <w:i/>
-          <w:color w:val="556581"/>
-          <w:sz w:val="20"/>
-        </w:rPr>
-        <w:t>Coaches have a read-only view of payments. They cannot process payments on behalf of players.</w:t>
-      </w:r>
-    </w:p>
-    <w:p>
-      <w:pPr>
-        <w:spacing w:before="360" w:after="80"/>
-        <w:jc w:val="left"/>
-      </w:pPr>
-      <w:r>
-        <w:rPr>
-          <w:b/>
-          <w:color w:val="0D1B3E"/>
-          <w:sz w:val="44"/>
-        </w:rPr>
-        <w:t>5.  Club Portal — Player</w:t>
-      </w:r>
-    </w:p>
-    <w:p>
-      <w:pPr>
-        <w:pBdr>
-          <w:bottom w:val="single" w:sz="6" w:space="1" w:color="16A34A"/>
-        </w:pBdr>
-        <w:spacing w:before="0" w:after="0"/>
-      </w:pPr>
-    </w:p>
-    <w:p>
-      <w:pPr>
-        <w:spacing w:before="40" w:after="80"/>
-      </w:pPr>
-      <w:r>
-        <w:rPr>
-          <w:i w:val="0"/>
-          <w:color w:val="1A1A2E"/>
-          <w:sz w:val="21"/>
-        </w:rPr>
-        <w:t>After logging in, players land on their Player Dashboard. The sidebar provides navigation to all player sections.</w:t>
-      </w:r>
-    </w:p>
-    <w:p>
-      <w:pPr>
-        <w:spacing w:before="280" w:after="60"/>
-      </w:pPr>
-      <w:r>
-        <w:rPr>
-          <w:b/>
-          <w:color w:val="0D1B3E"/>
-          <w:sz w:val="30"/>
-        </w:rPr>
-        <w:t>5.1  Dashboard &amp; Performance Analytics</w:t>
-      </w:r>
-    </w:p>
-    <w:p>
-      <w:pPr>
-        <w:spacing w:before="40" w:after="80"/>
-      </w:pPr>
-      <w:r>
-        <w:rPr>
-          <w:i w:val="0"/>
-          <w:color w:val="1A1A2E"/>
-          <w:sz w:val="21"/>
-        </w:rPr>
-        <w:t>The overview page shows:</w:t>
-      </w:r>
-    </w:p>
-    <w:p>
-      <w:pPr>
-        <w:pStyle w:val="ListBullet"/>
-        <w:spacing w:before="20" w:after="20"/>
-        <w:ind w:left="432"/>
-      </w:pPr>
-      <w:r>
-        <w:rPr>
-          <w:color w:val="1A1A2E"/>
-          <w:sz w:val="21"/>
-        </w:rPr>
-        <w:t>Current Form Rating — your average performance rating (0–10) from recent matches.</w:t>
-      </w:r>
-    </w:p>
-    <w:p>
-      <w:pPr>
-        <w:pStyle w:val="ListBullet"/>
-        <w:spacing w:before="20" w:after="20"/>
-        <w:ind w:left="432"/>
-      </w:pPr>
-      <w:r>
-        <w:rPr>
-          <w:color w:val="1A1A2E"/>
-          <w:sz w:val="21"/>
-        </w:rPr>
-        <w:t>Season Goals — total goals scored this season.</w:t>
-      </w:r>
-    </w:p>
-    <w:p>
-      <w:pPr>
-        <w:pStyle w:val="ListBullet"/>
-        <w:spacing w:before="20" w:after="20"/>
-        <w:ind w:left="432"/>
-      </w:pPr>
-      <w:r>
-        <w:rPr>
-          <w:color w:val="1A1A2E"/>
-          <w:sz w:val="21"/>
-        </w:rPr>
-        <w:t>Matches Played — total matches logged by your coach.</w:t>
-      </w:r>
-    </w:p>
-    <w:p>
-      <w:pPr>
-        <w:pStyle w:val="ListBullet"/>
-        <w:spacing w:before="20" w:after="20"/>
-        <w:ind w:left="432"/>
-      </w:pPr>
-      <w:r>
-        <w:rPr>
-          <w:color w:val="1A1A2E"/>
-          <w:sz w:val="21"/>
-        </w:rPr>
-        <w:t>Radar Chart (Attribute Wheel) — a visual breakdown of your six core attributes (each rated 0–100): Pace, Shooting, Passing, Dribbling, Defending, Physical.</w:t>
-      </w:r>
-    </w:p>
-    <w:p>
-      <w:pPr>
-        <w:pStyle w:val="ListBullet"/>
-        <w:spacing w:before="20" w:after="20"/>
-        <w:ind w:left="432"/>
-      </w:pPr>
-      <w:r>
-        <w:rPr>
-          <w:color w:val="1A1A2E"/>
-          <w:sz w:val="21"/>
-        </w:rPr>
-        <w:t>Performance Trend Chart — a line chart showing your match ratings over time, helping you track your form.</w:t>
-      </w:r>
-    </w:p>
-    <w:p>
-      <w:pPr>
-        <w:spacing w:before="80" w:after="120"/>
-        <w:ind w:left="360"/>
-        <w:shd w:val="clear" w:color="auto" w:fill="EEF4FF"/>
-      </w:pPr>
-      <w:r>
-        <w:rPr>
-          <w:b/>
-          <w:color w:val="0D1B3E"/>
-          <w:sz w:val="20"/>
-        </w:rPr>
-        <w:t xml:space="preserve">  Note:  </w:t>
-      </w:r>
-      <w:r>
-        <w:rPr>
-          <w:i/>
-          <w:color w:val="556581"/>
-          <w:sz w:val="20"/>
-        </w:rPr>
-        <w:t>These values are updated by your coach when match stats are recorded.</w:t>
-      </w:r>
-    </w:p>
-    <w:p>
-      <w:pPr>
-        <w:spacing w:before="280" w:after="60"/>
-      </w:pPr>
-      <w:r>
-        <w:rPr>
-          <w:b/>
-          <w:color w:val="0D1B3E"/>
-          <w:sz w:val="30"/>
-        </w:rPr>
-        <w:t>5.2  Announcements</w:t>
-      </w:r>
-    </w:p>
-    <w:p>
-      <w:pPr>
-        <w:spacing w:before="40" w:after="80"/>
-      </w:pPr>
-      <w:r>
-        <w:rPr>
-          <w:i w:val="0"/>
-          <w:color w:val="1A1A2E"/>
-          <w:sz w:val="21"/>
-        </w:rPr>
-        <w:t>Displays all announcements posted by your coach. The most recent announcement appears at the top.</w:t>
-      </w:r>
-    </w:p>
-    <w:p>
-      <w:pPr>
-        <w:spacing w:before="280" w:after="60"/>
-      </w:pPr>
-      <w:r>
-        <w:rPr>
-          <w:b/>
-          <w:color w:val="0D1B3E"/>
-          <w:sz w:val="30"/>
-        </w:rPr>
-        <w:t>5.3  Schedule</w:t>
-      </w:r>
-    </w:p>
-    <w:p>
-      <w:pPr>
-        <w:spacing w:before="40" w:after="80"/>
-      </w:pPr>
-      <w:r>
-        <w:rPr>
-          <w:i w:val="0"/>
-          <w:color w:val="1A1A2E"/>
-          <w:sz w:val="21"/>
-        </w:rPr>
-        <w:t>Shows upcoming matches and training sessions posted by your coach in a calendar view. Use this to stay up to date on fixtures and training dates.</w:t>
-      </w:r>
-    </w:p>
-    <w:p>
-      <w:pPr>
-        <w:spacing w:before="280" w:after="60"/>
-      </w:pPr>
-      <w:r>
-        <w:rPr>
-          <w:b/>
-          <w:color w:val="0D1B3E"/>
-          <w:sz w:val="30"/>
-        </w:rPr>
-        <w:t>5.4  Settings &amp; Profile</w:t>
-      </w:r>
-    </w:p>
-    <w:p>
-      <w:pPr>
-        <w:spacing w:before="40" w:after="80"/>
-      </w:pPr>
-      <w:r>
-        <w:rPr>
-          <w:i w:val="0"/>
-          <w:color w:val="1A1A2E"/>
-          <w:sz w:val="21"/>
-        </w:rPr>
-        <w:t>You can update the following:</w:t>
-      </w:r>
-    </w:p>
-    <w:p>
-      <w:pPr>
-        <w:pStyle w:val="ListBullet"/>
-        <w:spacing w:before="20" w:after="20"/>
-        <w:ind w:left="432"/>
-      </w:pPr>
-      <w:r>
-        <w:rPr>
-          <w:color w:val="1A1A2E"/>
-          <w:sz w:val="21"/>
-        </w:rPr>
-        <w:t>Profile photo</w:t>
-      </w:r>
-    </w:p>
-    <w:p>
-      <w:pPr>
-        <w:pStyle w:val="ListBullet"/>
-        <w:spacing w:before="20" w:after="20"/>
-        <w:ind w:left="432"/>
-      </w:pPr>
-      <w:r>
-        <w:rPr>
-          <w:color w:val="1A1A2E"/>
-          <w:sz w:val="21"/>
-        </w:rPr>
-        <w:t>Full name</w:t>
-      </w:r>
-    </w:p>
-    <w:p>
-      <w:pPr>
-        <w:pStyle w:val="ListBullet"/>
-        <w:spacing w:before="20" w:after="20"/>
-        <w:ind w:left="432"/>
-      </w:pPr>
-      <w:r>
-        <w:rPr>
-          <w:color w:val="1A1A2E"/>
-          <w:sz w:val="21"/>
-        </w:rPr>
-        <w:t>Height (cm) and Weight (kg)</w:t>
-      </w:r>
-    </w:p>
-    <w:p>
-      <w:pPr>
-        <w:pStyle w:val="ListBullet"/>
-        <w:spacing w:before="20" w:after="20"/>
-        <w:ind w:left="432"/>
-      </w:pPr>
-      <w:r>
-        <w:rPr>
-          <w:color w:val="1A1A2E"/>
-          <w:sz w:val="21"/>
-        </w:rPr>
-        <w:t>Strong foot (Left / Right / Both)</w:t>
-      </w:r>
-    </w:p>
-    <w:p>
-      <w:pPr>
-        <w:pStyle w:val="ListBullet"/>
-        <w:spacing w:before="20" w:after="20"/>
-        <w:ind w:left="432"/>
-      </w:pPr>
-      <w:r>
-        <w:rPr>
-          <w:color w:val="1A1A2E"/>
-          <w:sz w:val="21"/>
-        </w:rPr>
-        <w:t>Password — enter your current password and a new password to update it.</w:t>
-      </w:r>
-    </w:p>
-    <w:p>
-      <w:pPr>
-        <w:spacing w:before="40" w:after="80"/>
-      </w:pPr>
-      <w:r>
-        <w:rPr>
-          <w:i w:val="0"/>
-          <w:color w:val="1A1A2E"/>
-          <w:sz w:val="21"/>
-        </w:rPr>
-        <w:t>Click Save Changes after making any edits.</w:t>
-      </w:r>
-    </w:p>
-    <w:p>
-      <w:pPr>
-        <w:spacing w:before="280" w:after="60"/>
-      </w:pPr>
-      <w:r>
-        <w:rPr>
-          <w:b/>
-          <w:color w:val="0D1B3E"/>
-          <w:sz w:val="30"/>
-        </w:rPr>
-        <w:t>5.5  Payments</w:t>
-      </w:r>
-    </w:p>
-    <w:p>
-      <w:pPr>
-        <w:spacing w:before="40" w:after="80"/>
-      </w:pPr>
-      <w:r>
-        <w:rPr>
-          <w:i w:val="0"/>
-          <w:color w:val="1A1A2E"/>
-          <w:sz w:val="21"/>
-        </w:rPr>
-        <w:t>Manage your monthly team subscription fee of MYR 50.00 per month.</w:t>
-      </w:r>
-    </w:p>
-    <w:p>
-      <w:pPr>
-        <w:spacing w:before="200" w:after="40"/>
-      </w:pPr>
-      <w:r>
-        <w:rPr>
-          <w:b/>
-          <w:color w:val="16A34A"/>
-          <w:sz w:val="24"/>
-        </w:rPr>
-        <w:t>How to pay:</w:t>
-      </w:r>
-    </w:p>
-    <w:p>
-      <w:pPr>
-        <w:pStyle w:val="ListNumber"/>
-        <w:spacing w:before="40" w:after="40"/>
-        <w:ind w:left="432"/>
-      </w:pPr>
-      <w:r>
-        <w:rPr>
-          <w:color w:val="1A1A2E"/>
-          <w:sz w:val="21"/>
-        </w:rPr>
-        <w:t>Navigate to Payment in the sidebar.</w:t>
-      </w:r>
-    </w:p>
-    <w:p>
-      <w:pPr>
-        <w:pStyle w:val="ListNumber"/>
-        <w:spacing w:before="40" w:after="40"/>
-        <w:ind w:left="432"/>
-      </w:pPr>
-      <w:r>
-        <w:rPr>
-          <w:color w:val="1A1A2E"/>
-          <w:sz w:val="21"/>
-        </w:rPr>
-        <w:t>Your payment history is displayed by month (status: Pending or Completed).</w:t>
-      </w:r>
-    </w:p>
-    <w:p>
-      <w:pPr>
-        <w:pStyle w:val="ListNumber"/>
-        <w:spacing w:before="40" w:after="40"/>
-        <w:ind w:left="432"/>
-      </w:pPr>
-      <w:r>
-        <w:rPr>
-          <w:color w:val="1A1A2E"/>
-          <w:sz w:val="21"/>
-        </w:rPr>
-        <w:t>To pay for a pending month, click Pay Now.</w:t>
-      </w:r>
-    </w:p>
-    <w:p>
-      <w:pPr>
-        <w:pStyle w:val="ListNumber"/>
-        <w:spacing w:before="40" w:after="40"/>
-        <w:ind w:left="432"/>
-      </w:pPr>
-      <w:r>
-        <w:rPr>
-          <w:color w:val="1A1A2E"/>
-          <w:sz w:val="21"/>
-        </w:rPr>
-        <w:t>You will be redirected to Billplz, a secure Malaysian payment gateway.</w:t>
-      </w:r>
-    </w:p>
-    <w:p>
-      <w:pPr>
-        <w:pStyle w:val="ListNumber"/>
-        <w:spacing w:before="40" w:after="40"/>
-        <w:ind w:left="432"/>
-      </w:pPr>
-      <w:r>
-        <w:rPr>
-          <w:color w:val="1A1A2E"/>
-          <w:sz w:val="21"/>
-        </w:rPr>
-        <w:t>Complete the payment on the Billplz page.</w:t>
-      </w:r>
-    </w:p>
-    <w:p>
-      <w:pPr>
-        <w:pStyle w:val="ListNumber"/>
-        <w:spacing w:before="40" w:after="40"/>
-        <w:ind w:left="432"/>
-      </w:pPr>
-      <w:r>
-        <w:rPr>
-          <w:color w:val="1A1A2E"/>
-          <w:sz w:val="21"/>
-        </w:rPr>
-        <w:t>Once successful, you will be redirected back to NUVRA and the status will update to Completed.</w:t>
-      </w:r>
-    </w:p>
-    <w:p>
-      <w:pPr>
-        <w:spacing w:before="80" w:after="120"/>
-        <w:ind w:left="360"/>
-        <w:shd w:val="clear" w:color="auto" w:fill="EEF4FF"/>
-      </w:pPr>
-      <w:r>
-        <w:rPr>
-          <w:b/>
-          <w:color w:val="0D1B3E"/>
-          <w:sz w:val="20"/>
-        </w:rPr>
-        <w:t xml:space="preserve">  Note:  </w:t>
-      </w:r>
-      <w:r>
-        <w:rPr>
-          <w:i/>
-          <w:color w:val="556581"/>
-          <w:sz w:val="20"/>
-        </w:rPr>
-        <w:t>Supported payment methods depend on what is enabled via Billplz (typically FPX online banking).</w:t>
-      </w:r>
-    </w:p>
-    <w:p>
-      <w:pPr>
-        <w:spacing w:before="360" w:after="80"/>
-        <w:jc w:val="left"/>
-      </w:pPr>
-      <w:r>
-        <w:rPr>
-          <w:b/>
-          <w:color w:val="0D1B3E"/>
-          <w:sz w:val="44"/>
-        </w:rPr>
-        <w:t>6.  Community Portal — Community Player</w:t>
-      </w:r>
-    </w:p>
-    <w:p>
-      <w:pPr>
-        <w:pBdr>
-          <w:bottom w:val="single" w:sz="6" w:space="1" w:color="16A34A"/>
-        </w:pBdr>
-        <w:spacing w:before="0" w:after="0"/>
-      </w:pPr>
-    </w:p>
-    <w:p>
-      <w:pPr>
-        <w:spacing w:before="40" w:after="80"/>
-      </w:pPr>
-      <w:r>
-        <w:rPr>
-          <w:i w:val="0"/>
-          <w:color w:val="1A1A2E"/>
-          <w:sz w:val="21"/>
-        </w:rPr>
-        <w:t>After logging in to the Community Portal, players land on the Game Feed.</w:t>
-      </w:r>
-    </w:p>
-    <w:p>
-      <w:pPr>
-        <w:spacing w:before="280" w:after="60"/>
-      </w:pPr>
-      <w:r>
-        <w:rPr>
-          <w:b/>
-          <w:color w:val="0D1B3E"/>
-          <w:sz w:val="30"/>
-        </w:rPr>
-        <w:t>6.1  Browsing Games</w:t>
-      </w:r>
-    </w:p>
-    <w:p>
-      <w:pPr>
-        <w:spacing w:before="40" w:after="80"/>
-      </w:pPr>
-      <w:r>
-        <w:rPr>
-          <w:i w:val="0"/>
-          <w:color w:val="1A1A2E"/>
-          <w:sz w:val="21"/>
-        </w:rPr>
-        <w:t>The feed displays all available community games. Each game card shows:</w:t>
-      </w:r>
-    </w:p>
-    <w:p>
-      <w:pPr>
-        <w:pStyle w:val="ListBullet"/>
-        <w:spacing w:before="20" w:after="20"/>
-        <w:ind w:left="432"/>
-      </w:pPr>
-      <w:r>
-        <w:rPr>
-          <w:color w:val="1A1A2E"/>
-          <w:sz w:val="21"/>
-        </w:rPr>
-        <w:t>Game title and venue</w:t>
-      </w:r>
-    </w:p>
-    <w:p>
-      <w:pPr>
-        <w:pStyle w:val="ListBullet"/>
-        <w:spacing w:before="20" w:after="20"/>
-        <w:ind w:left="432"/>
-      </w:pPr>
-      <w:r>
-        <w:rPr>
-          <w:color w:val="1A1A2E"/>
-          <w:sz w:val="21"/>
-        </w:rPr>
-        <w:t>Date and time</w:t>
-      </w:r>
-    </w:p>
-    <w:p>
-      <w:pPr>
-        <w:pStyle w:val="ListBullet"/>
-        <w:spacing w:before="20" w:after="20"/>
-        <w:ind w:left="432"/>
-      </w:pPr>
-      <w:r>
-        <w:rPr>
-          <w:color w:val="1A1A2E"/>
-          <w:sz w:val="21"/>
-        </w:rPr>
-        <w:t>Team names (e.g., Team A vs Team B)</w:t>
-      </w:r>
-    </w:p>
-    <w:p>
-      <w:pPr>
-        <w:pStyle w:val="ListBullet"/>
-        <w:spacing w:before="20" w:after="20"/>
-        <w:ind w:left="432"/>
-      </w:pPr>
-      <w:r>
-        <w:rPr>
-          <w:color w:val="1A1A2E"/>
-          <w:sz w:val="21"/>
-        </w:rPr>
-        <w:t>Available slots per team</w:t>
-      </w:r>
-    </w:p>
-    <w:p>
-      <w:pPr>
-        <w:pStyle w:val="ListBullet"/>
-        <w:spacing w:before="20" w:after="20"/>
-        <w:ind w:left="432"/>
-      </w:pPr>
-      <w:r>
-        <w:rPr>
-          <w:color w:val="1A1A2E"/>
-          <w:sz w:val="21"/>
-        </w:rPr>
-        <w:t>Price per player</w:t>
-      </w:r>
-    </w:p>
-    <w:p>
-      <w:pPr>
-        <w:pStyle w:val="ListBullet"/>
-        <w:spacing w:before="20" w:after="20"/>
-        <w:ind w:left="432"/>
-      </w:pPr>
-      <w:r>
-        <w:rPr>
-          <w:color w:val="1A1A2E"/>
-          <w:sz w:val="21"/>
-        </w:rPr>
-        <w:t>Status: Open, Full, Cancelled, or Completed</w:t>
-      </w:r>
-    </w:p>
-    <w:p>
-      <w:pPr>
-        <w:spacing w:before="40" w:after="80"/>
-      </w:pPr>
-      <w:r>
-        <w:rPr>
-          <w:i w:val="0"/>
-          <w:color w:val="1A1A2E"/>
-          <w:sz w:val="21"/>
-        </w:rPr>
-        <w:t>Games marked Full have no remaining slots. Games marked Open are available to join.</w:t>
-      </w:r>
-    </w:p>
-    <w:p>
-      <w:pPr>
-        <w:spacing w:before="280" w:after="60"/>
-      </w:pPr>
-      <w:r>
-        <w:rPr>
-          <w:b/>
-          <w:color w:val="0D1B3E"/>
-          <w:sz w:val="30"/>
-        </w:rPr>
-        <w:t>6.2  Joining a Game</w:t>
-      </w:r>
-    </w:p>
-    <w:p>
-      <w:pPr>
-        <w:pStyle w:val="ListNumber"/>
-        <w:spacing w:before="40" w:after="40"/>
-        <w:ind w:left="432"/>
-      </w:pPr>
-      <w:r>
-        <w:rPr>
-          <w:color w:val="1A1A2E"/>
-          <w:sz w:val="21"/>
-        </w:rPr>
-        <w:t>Click on a game card to view full details.</w:t>
-      </w:r>
-    </w:p>
-    <w:p>
-      <w:pPr>
-        <w:pStyle w:val="ListNumber"/>
-        <w:spacing w:before="40" w:after="40"/>
-        <w:ind w:left="432"/>
-      </w:pPr>
-      <w:r>
-        <w:rPr>
-          <w:color w:val="1A1A2E"/>
-          <w:sz w:val="21"/>
-        </w:rPr>
-        <w:t>On the game detail page you can see the full description and current rosters for Team A and Team B.</w:t>
-      </w:r>
-    </w:p>
-    <w:p>
-      <w:pPr>
-        <w:pStyle w:val="ListNumber"/>
-        <w:spacing w:before="40" w:after="40"/>
-        <w:ind w:left="432"/>
-      </w:pPr>
-      <w:r>
-        <w:rPr>
-          <w:color w:val="1A1A2E"/>
-          <w:sz w:val="21"/>
-        </w:rPr>
-        <w:t>Click Join Game.</w:t>
-      </w:r>
-    </w:p>
-    <w:p>
-      <w:pPr>
-        <w:pStyle w:val="ListNumber"/>
-        <w:spacing w:before="40" w:after="40"/>
-        <w:ind w:left="432"/>
-      </w:pPr>
-      <w:r>
-        <w:rPr>
-          <w:color w:val="1A1A2E"/>
-          <w:sz w:val="21"/>
-        </w:rPr>
-        <w:t>Select which team you want to join — Team A or Team B.</w:t>
-      </w:r>
-    </w:p>
-    <w:p>
-      <w:pPr>
-        <w:pStyle w:val="ListNumber"/>
-        <w:spacing w:before="40" w:after="40"/>
-        <w:ind w:left="432"/>
-      </w:pPr>
-      <w:r>
-        <w:rPr>
-          <w:color w:val="1A1A2E"/>
-          <w:sz w:val="21"/>
-        </w:rPr>
-        <w:t>Confirm your booking.</w:t>
-      </w:r>
-    </w:p>
-    <w:p>
-      <w:pPr>
-        <w:spacing w:before="80" w:after="120"/>
-        <w:ind w:left="360"/>
-        <w:shd w:val="clear" w:color="auto" w:fill="EEF4FF"/>
-      </w:pPr>
-      <w:r>
-        <w:rPr>
-          <w:b/>
-          <w:color w:val="0D1B3E"/>
-          <w:sz w:val="20"/>
-        </w:rPr>
-        <w:t xml:space="preserve">  Note:  </w:t>
-      </w:r>
-      <w:r>
-        <w:rPr>
-          <w:i/>
-          <w:color w:val="556581"/>
-          <w:sz w:val="20"/>
-        </w:rPr>
-        <w:t>You cannot join a game you have already booked, and you cannot join a team that is already full.</w:t>
-      </w:r>
-    </w:p>
-    <w:p>
-      <w:pPr>
-        <w:spacing w:before="280" w:after="60"/>
-      </w:pPr>
-      <w:r>
-        <w:rPr>
-          <w:b/>
-          <w:color w:val="0D1B3E"/>
-          <w:sz w:val="30"/>
-        </w:rPr>
-        <w:t>6.3  Submitting Payment</w:t>
-      </w:r>
-    </w:p>
-    <w:p>
-      <w:pPr>
-        <w:spacing w:before="40" w:after="80"/>
-      </w:pPr>
-      <w:r>
-        <w:rPr>
-          <w:i w:val="0"/>
-          <w:color w:val="1A1A2E"/>
-          <w:sz w:val="21"/>
-        </w:rPr>
-        <w:t>After joining a game, you need to submit payment to confirm your spot.</w:t>
-      </w:r>
-    </w:p>
-    <w:p>
-      <w:pPr>
-        <w:pStyle w:val="ListNumber"/>
-        <w:spacing w:before="40" w:after="40"/>
-        <w:ind w:left="432"/>
-      </w:pPr>
-      <w:r>
-        <w:rPr>
-          <w:color w:val="1A1A2E"/>
-          <w:sz w:val="21"/>
-        </w:rPr>
-        <w:t>On the game detail page, you will see a payment QR code provided by the admin.</w:t>
-      </w:r>
-    </w:p>
-    <w:p>
-      <w:pPr>
-        <w:pStyle w:val="ListNumber"/>
-        <w:spacing w:before="40" w:after="40"/>
-        <w:ind w:left="432"/>
-      </w:pPr>
-      <w:r>
-        <w:rPr>
-          <w:color w:val="1A1A2E"/>
-          <w:sz w:val="21"/>
-        </w:rPr>
-        <w:t>Use your mobile banking app to scan the QR code and complete the payment.</w:t>
-      </w:r>
-    </w:p>
-    <w:p>
-      <w:pPr>
-        <w:pStyle w:val="ListNumber"/>
-        <w:spacing w:before="40" w:after="40"/>
-        <w:ind w:left="432"/>
-      </w:pPr>
-      <w:r>
-        <w:rPr>
-          <w:color w:val="1A1A2E"/>
-          <w:sz w:val="21"/>
-        </w:rPr>
-        <w:t>Take a screenshot or photo of your payment receipt.</w:t>
-      </w:r>
-    </w:p>
-    <w:p>
-      <w:pPr>
-        <w:pStyle w:val="ListNumber"/>
-        <w:spacing w:before="40" w:after="40"/>
-        <w:ind w:left="432"/>
-      </w:pPr>
-      <w:r>
-        <w:rPr>
-          <w:color w:val="1A1A2E"/>
-          <w:sz w:val="21"/>
-        </w:rPr>
-        <w:t>Return to the game page and click Submit Payment.</w:t>
-      </w:r>
-    </w:p>
-    <w:p>
-      <w:pPr>
-        <w:pStyle w:val="ListNumber"/>
-        <w:spacing w:before="40" w:after="40"/>
-        <w:ind w:left="432"/>
-      </w:pPr>
-      <w:r>
-        <w:rPr>
-          <w:color w:val="1A1A2E"/>
-          <w:sz w:val="21"/>
-        </w:rPr>
-        <w:t>Upload your receipt image.</w:t>
-      </w:r>
-    </w:p>
-    <w:p>
-      <w:pPr>
-        <w:pStyle w:val="ListNumber"/>
-        <w:spacing w:before="40" w:after="40"/>
-        <w:ind w:left="432"/>
-      </w:pPr>
-      <w:r>
-        <w:rPr>
-          <w:color w:val="1A1A2E"/>
-          <w:sz w:val="21"/>
-        </w:rPr>
-        <w:t>Your booking status will update to Payment Submitted and will be confirmed by the admin.</w:t>
-      </w:r>
-    </w:p>
-    <w:p>
-      <w:pPr>
-        <w:spacing w:before="280" w:after="60"/>
-      </w:pPr>
-      <w:r>
-        <w:rPr>
-          <w:b/>
-          <w:color w:val="0D1B3E"/>
-          <w:sz w:val="30"/>
-        </w:rPr>
-        <w:t>6.4  Community Announcements</w:t>
-      </w:r>
-    </w:p>
-    <w:p>
-      <w:pPr>
-        <w:spacing w:before="40" w:after="80"/>
-      </w:pPr>
-      <w:r>
-        <w:rPr>
-          <w:i w:val="0"/>
-          <w:color w:val="1A1A2E"/>
-          <w:sz w:val="21"/>
-        </w:rPr>
-        <w:t>Navigate to Announcements in the community menu to view the latest news, updates, and notices from the community admin.</w:t>
-      </w:r>
-    </w:p>
-    <w:p>
-      <w:pPr>
-        <w:spacing w:before="360" w:after="80"/>
-        <w:jc w:val="left"/>
-      </w:pPr>
-      <w:r>
-        <w:rPr>
-          <w:b/>
-          <w:color w:val="0D1B3E"/>
-          <w:sz w:val="44"/>
-        </w:rPr>
-        <w:t>7.  Community Portal — Community Admin</w:t>
-      </w:r>
-    </w:p>
-    <w:p>
-      <w:pPr>
-        <w:pBdr>
-          <w:bottom w:val="single" w:sz="6" w:space="1" w:color="16A34A"/>
-        </w:pBdr>
-        <w:spacing w:before="0" w:after="0"/>
-      </w:pPr>
-    </w:p>
-    <w:p>
-      <w:pPr>
-        <w:spacing w:before="40" w:after="80"/>
-      </w:pPr>
-      <w:r>
-        <w:rPr>
-          <w:i w:val="0"/>
-          <w:color w:val="1A1A2E"/>
-          <w:sz w:val="21"/>
-        </w:rPr>
-        <w:t>Community admins have access to all community player features, plus additional management tools.</w:t>
-      </w:r>
-    </w:p>
-    <w:p>
-      <w:pPr>
-        <w:spacing w:before="280" w:after="60"/>
-      </w:pPr>
-      <w:r>
-        <w:rPr>
-          <w:b/>
-          <w:color w:val="0D1B3E"/>
-          <w:sz w:val="30"/>
-        </w:rPr>
-        <w:t>7.1  Creating a Game</w:t>
-      </w:r>
-    </w:p>
-    <w:p>
-      <w:pPr>
-        <w:pStyle w:val="ListNumber"/>
-        <w:spacing w:before="40" w:after="40"/>
-        <w:ind w:left="432"/>
-      </w:pPr>
-      <w:r>
-        <w:rPr>
-          <w:color w:val="1A1A2E"/>
-          <w:sz w:val="21"/>
-        </w:rPr>
-        <w:t>Navigate to Admin → Create Game.</w:t>
-      </w:r>
-    </w:p>
-    <w:p>
-      <w:pPr>
-        <w:pStyle w:val="ListNumber"/>
-        <w:spacing w:before="40" w:after="40"/>
-        <w:ind w:left="432"/>
-      </w:pPr>
-      <w:r>
-        <w:rPr>
-          <w:color w:val="1A1A2E"/>
-          <w:sz w:val="21"/>
-        </w:rPr>
-        <w:t>Fill in the game details:</w:t>
-      </w:r>
-    </w:p>
-    <w:p>
-      <w:pPr>
-        <w:pStyle w:val="ListBullet"/>
-        <w:spacing w:before="20" w:after="20"/>
-        <w:ind w:left="432"/>
-      </w:pPr>
-      <w:r>
-        <w:rPr>
-          <w:color w:val="1A1A2E"/>
-          <w:sz w:val="21"/>
-        </w:rPr>
-        <w:t>Title — name of the game or event</w:t>
-      </w:r>
-    </w:p>
-    <w:p>
-      <w:pPr>
-        <w:pStyle w:val="ListBullet"/>
-        <w:spacing w:before="20" w:after="20"/>
-        <w:ind w:left="432"/>
-      </w:pPr>
-      <w:r>
-        <w:rPr>
-          <w:color w:val="1A1A2E"/>
-          <w:sz w:val="21"/>
-        </w:rPr>
-        <w:t>Venue — location of the game</w:t>
-      </w:r>
-    </w:p>
-    <w:p>
-      <w:pPr>
-        <w:pStyle w:val="ListBullet"/>
-        <w:spacing w:before="20" w:after="20"/>
-        <w:ind w:left="432"/>
-      </w:pPr>
-      <w:r>
-        <w:rPr>
-          <w:color w:val="1A1A2E"/>
-          <w:sz w:val="21"/>
-        </w:rPr>
-        <w:t>Date and time</w:t>
-      </w:r>
-    </w:p>
-    <w:p>
-      <w:pPr>
-        <w:pStyle w:val="ListBullet"/>
-        <w:spacing w:before="20" w:after="20"/>
-        <w:ind w:left="432"/>
-      </w:pPr>
-      <w:r>
-        <w:rPr>
-          <w:color w:val="1A1A2E"/>
-          <w:sz w:val="21"/>
-        </w:rPr>
-        <w:t>Team A Name and Team B Name</w:t>
-      </w:r>
-    </w:p>
-    <w:p>
-      <w:pPr>
-        <w:pStyle w:val="ListBullet"/>
-        <w:spacing w:before="20" w:after="20"/>
-        <w:ind w:left="432"/>
-      </w:pPr>
-      <w:r>
-        <w:rPr>
-          <w:color w:val="1A1A2E"/>
-          <w:sz w:val="21"/>
-        </w:rPr>
-        <w:t>Max slots per team (maximum number of players per side)</w:t>
-      </w:r>
-    </w:p>
-    <w:p>
-      <w:pPr>
-        <w:pStyle w:val="ListBullet"/>
-        <w:spacing w:before="20" w:after="20"/>
-        <w:ind w:left="432"/>
-      </w:pPr>
-      <w:r>
-        <w:rPr>
-          <w:color w:val="1A1A2E"/>
-          <w:sz w:val="21"/>
-        </w:rPr>
-        <w:t>Price per player (in MYR)</w:t>
-      </w:r>
-    </w:p>
-    <w:p>
-      <w:pPr>
-        <w:pStyle w:val="ListBullet"/>
-        <w:spacing w:before="20" w:after="20"/>
-        <w:ind w:left="432"/>
-      </w:pPr>
-      <w:r>
-        <w:rPr>
-          <w:color w:val="1A1A2E"/>
-          <w:sz w:val="21"/>
-        </w:rPr>
-        <w:t>Description — any additional information for players</w:t>
-      </w:r>
-    </w:p>
-    <w:p>
-      <w:pPr>
-        <w:pStyle w:val="ListBullet"/>
-        <w:spacing w:before="20" w:after="20"/>
-        <w:ind w:left="432"/>
-      </w:pPr>
-      <w:r>
-        <w:rPr>
-          <w:color w:val="1A1A2E"/>
-          <w:sz w:val="21"/>
-        </w:rPr>
-        <w:t>Payment QR Code — upload a QR code image for players to scan and pay</w:t>
-      </w:r>
-    </w:p>
-    <w:p>
-      <w:pPr>
-        <w:pStyle w:val="ListNumber"/>
-        <w:spacing w:before="40" w:after="40"/>
-        <w:ind w:left="432"/>
-      </w:pPr>
-      <w:r>
-        <w:rPr>
-          <w:color w:val="1A1A2E"/>
-          <w:sz w:val="21"/>
-        </w:rPr>
-        <w:t>Click Create Game — it will immediately appear on the community game feed.</w:t>
-      </w:r>
-    </w:p>
-    <w:p>
-      <w:pPr>
-        <w:spacing w:before="280" w:after="60"/>
-      </w:pPr>
-      <w:r>
-        <w:rPr>
-          <w:b/>
-          <w:color w:val="0D1B3E"/>
-          <w:sz w:val="30"/>
-        </w:rPr>
-        <w:t>7.2  Posting Announcements</w:t>
-      </w:r>
-    </w:p>
-    <w:p>
-      <w:pPr>
-        <w:pStyle w:val="ListNumber"/>
-        <w:spacing w:before="40" w:after="40"/>
-        <w:ind w:left="432"/>
-      </w:pPr>
-      <w:r>
-        <w:rPr>
-          <w:color w:val="1A1A2E"/>
-          <w:sz w:val="21"/>
-        </w:rPr>
-        <w:t>Navigate to Admin → Post Announcement.</w:t>
-      </w:r>
-    </w:p>
-    <w:p>
-      <w:pPr>
-        <w:pStyle w:val="ListNumber"/>
-        <w:spacing w:before="40" w:after="40"/>
-        <w:ind w:left="432"/>
-      </w:pPr>
-      <w:r>
-        <w:rPr>
-          <w:color w:val="1A1A2E"/>
-          <w:sz w:val="21"/>
-        </w:rPr>
-        <w:t>Enter a title and the announcement body/content.</w:t>
-      </w:r>
-    </w:p>
-    <w:p>
-      <w:pPr>
-        <w:pStyle w:val="ListNumber"/>
-        <w:spacing w:before="40" w:after="40"/>
-        <w:ind w:left="432"/>
-      </w:pPr>
-      <w:r>
-        <w:rPr>
-          <w:color w:val="1A1A2E"/>
-          <w:sz w:val="21"/>
-        </w:rPr>
-        <w:t>Click Post — all community members will see it in the Announcements section.</w:t>
-      </w:r>
-    </w:p>
-    <w:p>
-      <w:pPr>
-        <w:spacing w:before="40" w:after="80"/>
-      </w:pPr>
-      <w:r>
-        <w:rPr>
-          <w:i w:val="0"/>
-          <w:color w:val="1A1A2E"/>
-          <w:sz w:val="21"/>
-        </w:rPr>
-        <w:t>You can also delete outdated announcements from the same screen.</w:t>
-      </w:r>
-    </w:p>
-    <w:p>
-      <w:pPr>
-        <w:spacing w:before="280" w:after="60"/>
-      </w:pPr>
-      <w:r>
-        <w:rPr>
-          <w:b/>
-          <w:color w:val="0D1B3E"/>
-          <w:sz w:val="30"/>
-        </w:rPr>
-        <w:t>7.3  Analytics Dashboard</w:t>
-      </w:r>
-    </w:p>
-    <w:p>
-      <w:pPr>
-        <w:spacing w:before="40" w:after="80"/>
-      </w:pPr>
-      <w:r>
-        <w:rPr>
-          <w:i w:val="0"/>
-          <w:color w:val="1A1A2E"/>
-          <w:sz w:val="21"/>
-        </w:rPr>
-        <w:t>Navigate to Admin → Analytics to view community-wide statistics:</w:t>
-      </w:r>
-    </w:p>
-    <w:tbl>
-      <w:tblPr>
-        <w:tblStyle w:val="TableGrid"/>
-        <w:tblW w:type="auto" w:w="0"/>
-        <w:jc w:val="left"/>
-        <w:tblLook w:firstColumn="1" w:firstRow="1" w:lastColumn="0" w:lastRow="0" w:noHBand="0" w:noVBand="1" w:val="04A0"/>
-      </w:tblPr>
-      <w:tblGrid>
-        <w:gridCol w:w="4533"/>
-        <w:gridCol w:w="4533"/>
-      </w:tblGrid>
-      <w:tr>
-        <w:tc>
-          <w:tcPr>
-            <w:tcW w:type="dxa" w:w="3168"/>
-            <w:shd w:val="clear" w:color="auto" w:fill="0D1B3E"/>
-            <w:vAlign w:val="center"/>
-          </w:tcPr>
-          <w:p>
-            <w:pPr>
-              <w:spacing w:before="80" w:after="80"/>
-              <w:jc w:val="center"/>
-            </w:pPr>
-            <w:r>
-              <w:rPr>
-                <w:b/>
-                <w:color w:val="FFFFFF"/>
-                <w:sz w:val="20"/>
-              </w:rPr>
-              <w:t>Metric</w:t>
-            </w:r>
-          </w:p>
-        </w:tc>
-        <w:tc>
-          <w:tcPr>
-            <w:tcW w:type="dxa" w:w="6480"/>
-            <w:shd w:val="clear" w:color="auto" w:fill="0D1B3E"/>
-            <w:vAlign w:val="center"/>
-          </w:tcPr>
-          <w:p>
-            <w:pPr>
-              <w:spacing w:before="80" w:after="80"/>
-              <w:jc w:val="center"/>
-            </w:pPr>
-            <w:r>
-              <w:rPr>
-                <w:b/>
-                <w:color w:val="FFFFFF"/>
-                <w:sz w:val="20"/>
-              </w:rPr>
-              <w:t>Description</w:t>
-            </w:r>
-          </w:p>
-        </w:tc>
-      </w:tr>
-      <w:tr>
-        <w:tc>
-          <w:tcPr>
-            <w:tcW w:type="dxa" w:w="3168"/>
-            <w:shd w:val="clear" w:color="auto" w:fill="FFFFFF"/>
-            <w:vAlign w:val="center"/>
-          </w:tcPr>
-          <w:p>
-            <w:pPr>
-              <w:spacing w:before="60" w:after="60"/>
-            </w:pPr>
-            <w:r>
-              <w:rPr>
-                <w:color w:val="1A1A2E"/>
-                <w:sz w:val="20"/>
-              </w:rPr>
-              <w:t>Total Games Created</w:t>
-            </w:r>
-          </w:p>
-        </w:tc>
-        <w:tc>
-          <w:tcPr>
-            <w:tcW w:type="dxa" w:w="6480"/>
-            <w:shd w:val="clear" w:color="auto" w:fill="FFFFFF"/>
-            <w:vAlign w:val="center"/>
-          </w:tcPr>
-          <w:p>
-            <w:pPr>
-              <w:spacing w:before="60" w:after="60"/>
-            </w:pPr>
-            <w:r>
-              <w:rPr>
-                <w:color w:val="1A1A2E"/>
-                <w:sz w:val="20"/>
-              </w:rPr>
-              <w:t>Total number of games created on the platform</w:t>
-            </w:r>
-          </w:p>
-        </w:tc>
-      </w:tr>
-      <w:tr>
-        <w:tc>
-          <w:tcPr>
-            <w:tcW w:type="dxa" w:w="3168"/>
-            <w:shd w:val="clear" w:color="auto" w:fill="F5F7FB"/>
-            <w:vAlign w:val="center"/>
-          </w:tcPr>
-          <w:p>
-            <w:pPr>
-              <w:spacing w:before="60" w:after="60"/>
-            </w:pPr>
-            <w:r>
-              <w:rPr>
-                <w:color w:val="1A1A2E"/>
-                <w:sz w:val="20"/>
-              </w:rPr>
-              <w:t>Players Registered</w:t>
-            </w:r>
-          </w:p>
-        </w:tc>
-        <w:tc>
-          <w:tcPr>
-            <w:tcW w:type="dxa" w:w="6480"/>
-            <w:shd w:val="clear" w:color="auto" w:fill="F5F7FB"/>
-            <w:vAlign w:val="center"/>
-          </w:tcPr>
-          <w:p>
-            <w:pPr>
-              <w:spacing w:before="60" w:after="60"/>
-            </w:pPr>
-            <w:r>
-              <w:rPr>
-                <w:color w:val="1A1A2E"/>
-                <w:sz w:val="20"/>
-              </w:rPr>
-              <w:t>Total number of registered community players</w:t>
-            </w:r>
-          </w:p>
-        </w:tc>
-      </w:tr>
-      <w:tr>
-        <w:tc>
-          <w:tcPr>
-            <w:tcW w:type="dxa" w:w="3168"/>
-            <w:shd w:val="clear" w:color="auto" w:fill="FFFFFF"/>
-            <w:vAlign w:val="center"/>
-          </w:tcPr>
-          <w:p>
-            <w:pPr>
-              <w:spacing w:before="60" w:after="60"/>
-            </w:pPr>
-            <w:r>
-              <w:rPr>
-                <w:color w:val="1A1A2E"/>
-                <w:sz w:val="20"/>
-              </w:rPr>
-              <w:t>Monthly Revenue</w:t>
-            </w:r>
-          </w:p>
-        </w:tc>
-        <w:tc>
-          <w:tcPr>
-            <w:tcW w:type="dxa" w:w="6480"/>
-            <w:shd w:val="clear" w:color="auto" w:fill="FFFFFF"/>
-            <w:vAlign w:val="center"/>
-          </w:tcPr>
-          <w:p>
-            <w:pPr>
-              <w:spacing w:before="60" w:after="60"/>
-            </w:pPr>
-            <w:r>
-              <w:rPr>
-                <w:color w:val="1A1A2E"/>
-                <w:sz w:val="20"/>
-              </w:rPr>
-              <w:t>Total game fees collected in the current month</w:t>
-            </w:r>
-          </w:p>
-        </w:tc>
-      </w:tr>
-      <w:tr>
-        <w:tc>
-          <w:tcPr>
-            <w:tcW w:type="dxa" w:w="3168"/>
-            <w:shd w:val="clear" w:color="auto" w:fill="F5F7FB"/>
-            <w:vAlign w:val="center"/>
-          </w:tcPr>
-          <w:p>
-            <w:pPr>
-              <w:spacing w:before="60" w:after="60"/>
-            </w:pPr>
-            <w:r>
-              <w:rPr>
-                <w:color w:val="1A1A2E"/>
-                <w:sz w:val="20"/>
-              </w:rPr>
-              <w:t>Recent Activity</w:t>
-            </w:r>
-          </w:p>
-        </w:tc>
-        <w:tc>
-          <w:tcPr>
-            <w:tcW w:type="dxa" w:w="6480"/>
-            <w:shd w:val="clear" w:color="auto" w:fill="F5F7FB"/>
-            <w:vAlign w:val="center"/>
-          </w:tcPr>
-          <w:p>
-            <w:pPr>
-              <w:spacing w:before="60" w:after="60"/>
-            </w:pPr>
-            <w:r>
-              <w:rPr>
-                <w:color w:val="1A1A2E"/>
-                <w:sz w:val="20"/>
-              </w:rPr>
-              <w:t>Live feed of new bookings and player registrations</w:t>
-            </w:r>
-          </w:p>
-        </w:tc>
-      </w:tr>
-    </w:tbl>
-    <w:p/>
-    <w:p>
-      <w:pPr>
-        <w:spacing w:before="360" w:after="80"/>
-        <w:jc w:val="left"/>
-      </w:pPr>
-      <w:r>
-        <w:rPr>
-          <w:b/>
-          <w:color w:val="0D1B3E"/>
-          <w:sz w:val="44"/>
-        </w:rPr>
-        <w:t>8.  Payments Summary</w:t>
-      </w:r>
-    </w:p>
-    <w:p>
-      <w:pPr>
-        <w:pBdr>
-          <w:bottom w:val="single" w:sz="6" w:space="1" w:color="16A34A"/>
-        </w:pBdr>
-        <w:spacing w:before="0" w:after="0"/>
-      </w:pPr>
-    </w:p>
-    <w:tbl>
-      <w:tblPr>
-        <w:tblStyle w:val="TableGrid"/>
-        <w:tblW w:type="auto" w:w="0"/>
-        <w:jc w:val="left"/>
-        <w:tblLook w:firstColumn="1" w:firstRow="1" w:lastColumn="0" w:lastRow="0" w:noHBand="0" w:noVBand="1" w:val="04A0"/>
-      </w:tblPr>
-      <w:tblGrid>
-        <w:gridCol w:w="1813"/>
-        <w:gridCol w:w="1813"/>
-        <w:gridCol w:w="1813"/>
-        <w:gridCol w:w="1813"/>
-        <w:gridCol w:w="1813"/>
-      </w:tblGrid>
-      <w:tr>
-        <w:tc>
-          <w:tcPr>
-            <w:tcW w:type="dxa" w:w="2448"/>
-            <w:shd w:val="clear" w:color="auto" w:fill="0D1B3E"/>
-            <w:vAlign w:val="center"/>
-          </w:tcPr>
-          <w:p>
-            <w:pPr>
-              <w:spacing w:before="80" w:after="80"/>
-              <w:jc w:val="center"/>
-            </w:pPr>
-            <w:r>
-              <w:rPr>
-                <w:b/>
-                <w:color w:val="FFFFFF"/>
-                <w:sz w:val="20"/>
-              </w:rPr>
-              <w:t>Payment Type</w:t>
-            </w:r>
-          </w:p>
-        </w:tc>
-        <w:tc>
-          <w:tcPr>
-            <w:tcW w:type="dxa" w:w="2016"/>
-            <w:shd w:val="clear" w:color="auto" w:fill="0D1B3E"/>
-            <w:vAlign w:val="center"/>
-          </w:tcPr>
-          <w:p>
-            <w:pPr>
-              <w:spacing w:before="80" w:after="80"/>
-              <w:jc w:val="center"/>
-            </w:pPr>
-            <w:r>
-              <w:rPr>
-                <w:b/>
-                <w:color w:val="FFFFFF"/>
-                <w:sz w:val="20"/>
-              </w:rPr>
-              <w:t>Portal</w:t>
-            </w:r>
-          </w:p>
-        </w:tc>
-        <w:tc>
-          <w:tcPr>
-            <w:tcW w:type="dxa" w:w="2160"/>
-            <w:shd w:val="clear" w:color="auto" w:fill="0D1B3E"/>
-            <w:vAlign w:val="center"/>
-          </w:tcPr>
-          <w:p>
-            <w:pPr>
-              <w:spacing w:before="80" w:after="80"/>
-              <w:jc w:val="center"/>
-            </w:pPr>
-            <w:r>
-              <w:rPr>
-                <w:b/>
-                <w:color w:val="FFFFFF"/>
-                <w:sz w:val="20"/>
-              </w:rPr>
-              <w:t>Amount</w:t>
-            </w:r>
-          </w:p>
-        </w:tc>
-        <w:tc>
-          <w:tcPr>
-            <w:tcW w:type="dxa" w:w="2160"/>
-            <w:shd w:val="clear" w:color="auto" w:fill="0D1B3E"/>
-            <w:vAlign w:val="center"/>
-          </w:tcPr>
-          <w:p>
-            <w:pPr>
-              <w:spacing w:before="80" w:after="80"/>
-              <w:jc w:val="center"/>
-            </w:pPr>
-            <w:r>
-              <w:rPr>
-                <w:b/>
-                <w:color w:val="FFFFFF"/>
-                <w:sz w:val="20"/>
-              </w:rPr>
-              <w:t>Gateway</w:t>
-            </w:r>
-          </w:p>
-        </w:tc>
-        <w:tc>
-          <w:tcPr>
-            <w:tcW w:type="dxa" w:w="1728"/>
-            <w:shd w:val="clear" w:color="auto" w:fill="0D1B3E"/>
-            <w:vAlign w:val="center"/>
-          </w:tcPr>
-          <w:p>
-            <w:pPr>
-              <w:spacing w:before="80" w:after="80"/>
-              <w:jc w:val="center"/>
-            </w:pPr>
-            <w:r>
-              <w:rPr>
-                <w:b/>
-                <w:color w:val="FFFFFF"/>
-                <w:sz w:val="20"/>
-              </w:rPr>
-              <w:t>Who Pays</w:t>
-            </w:r>
-          </w:p>
-        </w:tc>
-      </w:tr>
-      <w:tr>
-        <w:tc>
-          <w:tcPr>
-            <w:tcW w:type="dxa" w:w="2448"/>
-            <w:shd w:val="clear" w:color="auto" w:fill="FFFFFF"/>
-            <w:vAlign w:val="center"/>
-          </w:tcPr>
-          <w:p>
-            <w:pPr>
-              <w:spacing w:before="60" w:after="60"/>
-            </w:pPr>
-            <w:r>
-              <w:rPr>
-                <w:color w:val="1A1A2E"/>
-                <w:sz w:val="20"/>
-              </w:rPr>
-              <w:t>Monthly Subscription</w:t>
-            </w:r>
-          </w:p>
-        </w:tc>
-        <w:tc>
-          <w:tcPr>
-            <w:tcW w:type="dxa" w:w="2016"/>
-            <w:shd w:val="clear" w:color="auto" w:fill="FFFFFF"/>
-            <w:vAlign w:val="center"/>
-          </w:tcPr>
-          <w:p>
-            <w:pPr>
-              <w:spacing w:before="60" w:after="60"/>
-            </w:pPr>
-            <w:r>
-              <w:rPr>
-                <w:color w:val="1A1A2E"/>
-                <w:sz w:val="20"/>
-              </w:rPr>
-              <w:t>Club Portal</w:t>
-            </w:r>
-          </w:p>
-        </w:tc>
-        <w:tc>
-          <w:tcPr>
-            <w:tcW w:type="dxa" w:w="2160"/>
-            <w:shd w:val="clear" w:color="auto" w:fill="FFFFFF"/>
-            <w:vAlign w:val="center"/>
-          </w:tcPr>
-          <w:p>
-            <w:pPr>
-              <w:spacing w:before="60" w:after="60"/>
-            </w:pPr>
-            <w:r>
-              <w:rPr>
-                <w:color w:val="1A1A2E"/>
-                <w:sz w:val="20"/>
-              </w:rPr>
-              <w:t>MYR 50.00 / month</w:t>
-            </w:r>
-          </w:p>
-        </w:tc>
-        <w:tc>
-          <w:tcPr>
-            <w:tcW w:type="dxa" w:w="2160"/>
-            <w:shd w:val="clear" w:color="auto" w:fill="FFFFFF"/>
-            <w:vAlign w:val="center"/>
-          </w:tcPr>
-          <w:p>
-            <w:pPr>
-              <w:spacing w:before="60" w:after="60"/>
-            </w:pPr>
-            <w:r>
-              <w:rPr>
-                <w:color w:val="1A1A2E"/>
-                <w:sz w:val="20"/>
-              </w:rPr>
-              <w:t>Billplz (FPX)</w:t>
-            </w:r>
-          </w:p>
-        </w:tc>
-        <w:tc>
-          <w:tcPr>
-            <w:tcW w:type="dxa" w:w="1728"/>
-            <w:shd w:val="clear" w:color="auto" w:fill="FFFFFF"/>
-            <w:vAlign w:val="center"/>
-          </w:tcPr>
-          <w:p>
-            <w:pPr>
-              <w:spacing w:before="60" w:after="60"/>
-            </w:pPr>
-            <w:r>
-              <w:rPr>
-                <w:color w:val="1A1A2E"/>
-                <w:sz w:val="20"/>
-              </w:rPr>
-              <w:t>Players</w:t>
-            </w:r>
-          </w:p>
-        </w:tc>
-      </w:tr>
-      <w:tr>
-        <w:tc>
-          <w:tcPr>
-            <w:tcW w:type="dxa" w:w="2448"/>
-            <w:shd w:val="clear" w:color="auto" w:fill="F5F7FB"/>
-            <w:vAlign w:val="center"/>
-          </w:tcPr>
-          <w:p>
-            <w:pPr>
-              <w:spacing w:before="60" w:after="60"/>
-            </w:pPr>
-            <w:r>
-              <w:rPr>
-                <w:color w:val="1A1A2E"/>
-                <w:sz w:val="20"/>
-              </w:rPr>
-              <w:t>Game Fee</w:t>
-            </w:r>
-          </w:p>
-        </w:tc>
-        <w:tc>
-          <w:tcPr>
-            <w:tcW w:type="dxa" w:w="2016"/>
-            <w:shd w:val="clear" w:color="auto" w:fill="F5F7FB"/>
-            <w:vAlign w:val="center"/>
-          </w:tcPr>
-          <w:p>
-            <w:pPr>
-              <w:spacing w:before="60" w:after="60"/>
-            </w:pPr>
-            <w:r>
-              <w:rPr>
-                <w:color w:val="1A1A2E"/>
-                <w:sz w:val="20"/>
-              </w:rPr>
-              <w:t>Community Portal</w:t>
-            </w:r>
-          </w:p>
-        </w:tc>
-        <w:tc>
-          <w:tcPr>
-            <w:tcW w:type="dxa" w:w="2160"/>
-            <w:shd w:val="clear" w:color="auto" w:fill="F5F7FB"/>
-            <w:vAlign w:val="center"/>
-          </w:tcPr>
-          <w:p>
-            <w:pPr>
-              <w:spacing w:before="60" w:after="60"/>
-            </w:pPr>
-            <w:r>
-              <w:rPr>
-                <w:color w:val="1A1A2E"/>
-                <w:sz w:val="20"/>
-              </w:rPr>
-              <w:t>Set per game</w:t>
-            </w:r>
-          </w:p>
-        </w:tc>
-        <w:tc>
-          <w:tcPr>
-            <w:tcW w:type="dxa" w:w="2160"/>
-            <w:shd w:val="clear" w:color="auto" w:fill="F5F7FB"/>
-            <w:vAlign w:val="center"/>
-          </w:tcPr>
-          <w:p>
-            <w:pPr>
-              <w:spacing w:before="60" w:after="60"/>
-            </w:pPr>
-            <w:r>
-              <w:rPr>
-                <w:color w:val="1A1A2E"/>
-                <w:sz w:val="20"/>
-              </w:rPr>
-              <w:t>QR Code (manual)</w:t>
-            </w:r>
-          </w:p>
-        </w:tc>
-        <w:tc>
-          <w:tcPr>
-            <w:tcW w:type="dxa" w:w="1728"/>
-            <w:shd w:val="clear" w:color="auto" w:fill="F5F7FB"/>
-            <w:vAlign w:val="center"/>
-          </w:tcPr>
-          <w:p>
-            <w:pPr>
-              <w:spacing w:before="60" w:after="60"/>
-            </w:pPr>
-            <w:r>
-              <w:rPr>
-                <w:color w:val="1A1A2E"/>
-                <w:sz w:val="20"/>
-              </w:rPr>
-              <w:t>Community Players</w:t>
-            </w:r>
-          </w:p>
-        </w:tc>
-      </w:tr>
-    </w:tbl>
-    <w:p/>
-    <w:p>
-      <w:pPr>
-        <w:spacing w:before="40" w:after="80"/>
-      </w:pPr>
-      <w:r>
-        <w:rPr>
-          <w:i w:val="0"/>
-          <w:color w:val="1A1A2E"/>
-          <w:sz w:val="21"/>
-        </w:rPr>
-        <w:t>Club Portal payments are processed securely through Billplz, a certified Malaysian payment processor. Players are redirected to Billplz and returned to NUVRA after payment is completed.</w:t>
-      </w:r>
-    </w:p>
-    <w:p>
-      <w:pPr>
-        <w:spacing w:before="40" w:after="80"/>
-      </w:pPr>
-      <w:r>
-        <w:rPr>
-          <w:i w:val="0"/>
-          <w:color w:val="1A1A2E"/>
-          <w:sz w:val="21"/>
-        </w:rPr>
-        <w:t>Community Portal payments are made by scanning a QR code provided by the admin. Players then upload proof of payment for admin confirmation.</w:t>
-      </w:r>
-    </w:p>
-    <w:p>
-      <w:pPr>
-        <w:spacing w:before="360" w:after="80"/>
-        <w:jc w:val="left"/>
-      </w:pPr>
-      <w:r>
-        <w:rPr>
-          <w:b/>
-          <w:color w:val="0D1B3E"/>
-          <w:sz w:val="44"/>
-        </w:rPr>
-        <w:t>9.  Frequently Asked Questions</w:t>
-      </w:r>
-    </w:p>
-    <w:p>
-      <w:pPr>
-        <w:pBdr>
-          <w:bottom w:val="single" w:sz="6" w:space="1" w:color="16A34A"/>
-        </w:pBdr>
-        <w:spacing w:before="0" w:after="0"/>
-      </w:pPr>
-    </w:p>
-    <w:p>
-      <w:pPr>
-        <w:spacing w:before="160" w:after="20"/>
-      </w:pPr>
-      <w:r>
-        <w:rPr>
-          <w:b/>
-          <w:color w:val="0D1B3E"/>
-          <w:sz w:val="21"/>
-        </w:rPr>
-        <w:t>Q:  Can I use the same account for both the Club Portal and the Community Portal?</w:t>
-      </w:r>
-    </w:p>
-    <w:p>
-      <w:pPr>
-        <w:spacing w:before="0" w:after="40"/>
-        <w:ind w:left="288"/>
-      </w:pPr>
-      <w:r>
-        <w:rPr>
-          <w:color w:val="1A1A2E"/>
-          <w:sz w:val="21"/>
-        </w:rPr>
-        <w:t>A:  No. The Club Portal and Community Portal have separate registration and login systems. You will need a separate account for each.</w:t>
-      </w:r>
-    </w:p>
-    <w:p>
-      <w:pPr>
-        <w:spacing w:before="160" w:after="20"/>
-      </w:pPr>
-      <w:r>
-        <w:rPr>
-          <w:b/>
-          <w:color w:val="0D1B3E"/>
-          <w:sz w:val="21"/>
-        </w:rPr>
-        <w:t>Q:  I registered as a player but cannot access my dashboard. What should I do?</w:t>
-      </w:r>
-    </w:p>
-    <w:p>
-      <w:pPr>
-        <w:spacing w:before="0" w:after="40"/>
-        <w:ind w:left="288"/>
-      </w:pPr>
-      <w:r>
-        <w:rPr>
-          <w:color w:val="1A1A2E"/>
-          <w:sz w:val="21"/>
-        </w:rPr>
-        <w:t>A:  New players start with a Pending status and must wait for their coach to approve them. You will see a Waiting Room page until approval is granted. Contact your coach if you have been waiting a long time.</w:t>
-      </w:r>
-    </w:p>
-    <w:p>
-      <w:pPr>
-        <w:spacing w:before="160" w:after="20"/>
-      </w:pPr>
-      <w:r>
-        <w:rPr>
-          <w:b/>
-          <w:color w:val="0D1B3E"/>
-          <w:sz w:val="21"/>
-        </w:rPr>
-        <w:t>Q:  How do I change the team I belong to?</w:t>
-      </w:r>
-    </w:p>
-    <w:p>
-      <w:pPr>
-        <w:spacing w:before="0" w:after="40"/>
-        <w:ind w:left="288"/>
-      </w:pPr>
-      <w:r>
-        <w:rPr>
-          <w:color w:val="1A1A2E"/>
-          <w:sz w:val="21"/>
-        </w:rPr>
-        <w:t>A:  Team assignment is done during onboarding (initial registration). To change teams, contact your coach or the platform administrator.</w:t>
-      </w:r>
-    </w:p>
-    <w:p>
-      <w:pPr>
-        <w:spacing w:before="160" w:after="20"/>
-      </w:pPr>
-      <w:r>
-        <w:rPr>
-          <w:b/>
-          <w:color w:val="0D1B3E"/>
-          <w:sz w:val="21"/>
-        </w:rPr>
-        <w:t>Q:  My performance stats look wrong. Who do I contact?</w:t>
-      </w:r>
-    </w:p>
-    <w:p>
-      <w:pPr>
-        <w:spacing w:before="0" w:after="40"/>
-        <w:ind w:left="288"/>
-      </w:pPr>
-      <w:r>
-        <w:rPr>
-          <w:color w:val="1A1A2E"/>
-          <w:sz w:val="21"/>
-        </w:rPr>
-        <w:t>A:  Performance stats are entered by your coach. If you notice an error, please reach out directly to your coach to have it corrected.</w:t>
-      </w:r>
-    </w:p>
-    <w:p>
-      <w:pPr>
-        <w:spacing w:before="160" w:after="20"/>
-      </w:pPr>
-      <w:r>
-        <w:rPr>
-          <w:b/>
-          <w:color w:val="0D1B3E"/>
-          <w:sz w:val="21"/>
-        </w:rPr>
-        <w:t>Q:  A community game is showing as Full. Can I join a waitlist?</w:t>
-      </w:r>
-    </w:p>
-    <w:p>
-      <w:pPr>
-        <w:spacing w:before="0" w:after="40"/>
-        <w:ind w:left="288"/>
-      </w:pPr>
-      <w:r>
-        <w:rPr>
-          <w:color w:val="1A1A2E"/>
-          <w:sz w:val="21"/>
-        </w:rPr>
-        <w:t>A:  Currently, there is no waitlist feature. You can check back later in case a player cancels their booking, which may free up a slot.</w:t>
-      </w:r>
-    </w:p>
-    <w:p>
-      <w:pPr>
-        <w:spacing w:before="160" w:after="20"/>
-      </w:pPr>
-      <w:r>
-        <w:rPr>
-          <w:b/>
-          <w:color w:val="0D1B3E"/>
-          <w:sz w:val="21"/>
-        </w:rPr>
-        <w:t>Q:  I submitted my payment receipt for a community game but my booking is not confirmed. What should I do?</w:t>
-      </w:r>
-    </w:p>
-    <w:p>
-      <w:pPr>
-        <w:spacing w:before="0" w:after="40"/>
-        <w:ind w:left="288"/>
-      </w:pPr>
-      <w:r>
-        <w:rPr>
-          <w:color w:val="1A1A2E"/>
-          <w:sz w:val="21"/>
-        </w:rPr>
-        <w:t>A:  Payment confirmation is done manually by the community admin. Allow some time for the admin to review your receipt. If it has been an extended period, contact the community admin directly.</w:t>
-      </w:r>
-    </w:p>
-    <w:p>
-      <w:pPr>
-        <w:spacing w:before="160" w:after="20"/>
-      </w:pPr>
-      <w:r>
-        <w:rPr>
-          <w:b/>
-          <w:color w:val="0D1B3E"/>
-          <w:sz w:val="21"/>
-        </w:rPr>
-        <w:t>Q:  I forgot my Club Portal password. How do I reset it?</w:t>
-      </w:r>
-    </w:p>
-    <w:p>
-      <w:pPr>
-        <w:spacing w:before="0" w:after="40"/>
-        <w:ind w:left="288"/>
-      </w:pPr>
-      <w:r>
-        <w:rPr>
-          <w:color w:val="1A1A2E"/>
-          <w:sz w:val="21"/>
-        </w:rPr>
-        <w:t>A:  Click Forgot Password on the Club Portal login page, enter your email, and follow the reset link sent to your inbox.</w:t>
-      </w:r>
-    </w:p>
-    <w:p>
-      <w:pPr>
-        <w:spacing w:before="160" w:after="20"/>
-      </w:pPr>
-      <w:r>
-        <w:rPr>
-          <w:b/>
-          <w:color w:val="0D1B3E"/>
-          <w:sz w:val="21"/>
-        </w:rPr>
-        <w:t>Q:  Can I log in to the Club Portal using Google?</w:t>
-      </w:r>
-    </w:p>
-    <w:p>
-      <w:pPr>
-        <w:spacing w:before="0" w:after="40"/>
-        <w:ind w:left="288"/>
-      </w:pPr>
-      <w:r>
-        <w:rPr>
-          <w:color w:val="1A1A2E"/>
-          <w:sz w:val="21"/>
-        </w:rPr>
-        <w:t>A:  Yes. Click Continue with Google on the login page. If it is your first time, you will be taken through the onboarding steps to set up your player profile.</w:t>
-      </w:r>
-    </w:p>
-    <w:p>
-      <w:pPr>
-        <w:pBdr>
-          <w:bottom w:val="single" w:sz="6" w:space="1" w:color="C0C8D8"/>
-        </w:pBdr>
-        <w:spacing w:before="0" w:after="0"/>
-      </w:pPr>
-    </w:p>
-    <w:p>
-      <w:pPr>
-        <w:spacing w:before="160"/>
-        <w:jc w:val="center"/>
-      </w:pPr>
-      <w:r>
-        <w:rPr>
-          <w:i/>
-          <w:color w:val="556581"/>
-          <w:sz w:val="19"/>
-        </w:rPr>
-        <w:t>For technical issues or platform support, please contact the NUVRA platform administrator.</w:t>
+        <w:t>*End User Documentation | Updated June 11, 2026*</w:t>
       </w:r>
     </w:p>
     <w:sectPr>
       <w:pgSz w:w="12240" w:h="15840"/>
-      <w:pgMar w:top="1417" w:right="1587" w:bottom="1417" w:left="1587" w:header="720" w:footer="720" w:gutter="0"/>
+      <w:pgMar w:top="1440" w:right="1800" w:bottom="1440" w:left="1800" w:header="720" w:footer="720" w:gutter="0"/>
       <w:cols w:space="720"/>
       <w:docGrid w:linePitch="360"/>
     </w:sectPr>

</xml_diff>